<commit_message>
License the project under MIT
</commit_message>
<xml_diff>
--- a/docs/NToNMultiSelect - Technical Reference.docx
+++ b/docs/NToNMultiSelect - Technical Reference.docx
@@ -474,7 +474,7 @@
       <w:r>
         <w:fldChar w:fldCharType="separate"/>
       </w:r>
-      <w:hyperlink w:anchor="_Toc241869348" w:history="1">
+      <w:hyperlink w:anchor="_Toc241877246" w:history="1">
         <w:r>
           <w:rPr>
             <w:rStyle w:val="Hyperlink"/>
@@ -501,7 +501,7 @@
             <w:noProof/>
             <w:webHidden/>
           </w:rPr>
-          <w:instrText xml:space="preserve"> PAGEREF _Toc241869348 \h </w:instrText>
+          <w:instrText xml:space="preserve"> PAGEREF _Toc241877246 \h </w:instrText>
         </w:r>
         <w:r>
           <w:rPr>
@@ -548,7 +548,7 @@
           <w14:ligatures w14:val="standardContextual"/>
         </w:rPr>
       </w:pPr>
-      <w:hyperlink w:anchor="_Toc241869349" w:history="1">
+      <w:hyperlink w:anchor="_Toc241877247" w:history="1">
         <w:r>
           <w:rPr>
             <w:rStyle w:val="Hyperlink"/>
@@ -575,7 +575,7 @@
             <w:noProof/>
             <w:webHidden/>
           </w:rPr>
-          <w:instrText xml:space="preserve"> PAGEREF _Toc241869349 \h </w:instrText>
+          <w:instrText xml:space="preserve"> PAGEREF _Toc241877247 \h </w:instrText>
         </w:r>
         <w:r>
           <w:rPr>
@@ -622,7 +622,7 @@
           <w14:ligatures w14:val="standardContextual"/>
         </w:rPr>
       </w:pPr>
-      <w:hyperlink w:anchor="_Toc241869350" w:history="1">
+      <w:hyperlink w:anchor="_Toc241877248" w:history="1">
         <w:r>
           <w:rPr>
             <w:rStyle w:val="Hyperlink"/>
@@ -649,7 +649,7 @@
             <w:noProof/>
             <w:webHidden/>
           </w:rPr>
-          <w:instrText xml:space="preserve"> PAGEREF _Toc241869350 \h </w:instrText>
+          <w:instrText xml:space="preserve"> PAGEREF _Toc241877248 \h </w:instrText>
         </w:r>
         <w:r>
           <w:rPr>
@@ -696,7 +696,7 @@
           <w14:ligatures w14:val="standardContextual"/>
         </w:rPr>
       </w:pPr>
-      <w:hyperlink w:anchor="_Toc241869351" w:history="1">
+      <w:hyperlink w:anchor="_Toc241877249" w:history="1">
         <w:r>
           <w:rPr>
             <w:rStyle w:val="Hyperlink"/>
@@ -723,7 +723,7 @@
             <w:noProof/>
             <w:webHidden/>
           </w:rPr>
-          <w:instrText xml:space="preserve"> PAGEREF _Toc241869351 \h </w:instrText>
+          <w:instrText xml:space="preserve"> PAGEREF _Toc241877249 \h </w:instrText>
         </w:r>
         <w:r>
           <w:rPr>
@@ -770,7 +770,7 @@
           <w14:ligatures w14:val="standardContextual"/>
         </w:rPr>
       </w:pPr>
-      <w:hyperlink w:anchor="_Toc241869352" w:history="1">
+      <w:hyperlink w:anchor="_Toc241877250" w:history="1">
         <w:r>
           <w:rPr>
             <w:rStyle w:val="Hyperlink"/>
@@ -797,7 +797,7 @@
             <w:noProof/>
             <w:webHidden/>
           </w:rPr>
-          <w:instrText xml:space="preserve"> PAGEREF _Toc241869352 \h </w:instrText>
+          <w:instrText xml:space="preserve"> PAGEREF _Toc241877250 \h </w:instrText>
         </w:r>
         <w:r>
           <w:rPr>
@@ -844,7 +844,7 @@
           <w14:ligatures w14:val="standardContextual"/>
         </w:rPr>
       </w:pPr>
-      <w:hyperlink w:anchor="_Toc241869353" w:history="1">
+      <w:hyperlink w:anchor="_Toc241877251" w:history="1">
         <w:r>
           <w:rPr>
             <w:rStyle w:val="Hyperlink"/>
@@ -871,7 +871,7 @@
             <w:noProof/>
             <w:webHidden/>
           </w:rPr>
-          <w:instrText xml:space="preserve"> PAGEREF _Toc241869353 \h </w:instrText>
+          <w:instrText xml:space="preserve"> PAGEREF _Toc241877251 \h </w:instrText>
         </w:r>
         <w:r>
           <w:rPr>
@@ -918,7 +918,7 @@
           <w14:ligatures w14:val="standardContextual"/>
         </w:rPr>
       </w:pPr>
-      <w:hyperlink w:anchor="_Toc241869354" w:history="1">
+      <w:hyperlink w:anchor="_Toc241877252" w:history="1">
         <w:r>
           <w:rPr>
             <w:rStyle w:val="Hyperlink"/>
@@ -945,7 +945,7 @@
             <w:noProof/>
             <w:webHidden/>
           </w:rPr>
-          <w:instrText xml:space="preserve"> PAGEREF _Toc241869354 \h </w:instrText>
+          <w:instrText xml:space="preserve"> PAGEREF _Toc241877252 \h </w:instrText>
         </w:r>
         <w:r>
           <w:rPr>
@@ -992,7 +992,7 @@
           <w14:ligatures w14:val="standardContextual"/>
         </w:rPr>
       </w:pPr>
-      <w:hyperlink w:anchor="_Toc241869355" w:history="1">
+      <w:hyperlink w:anchor="_Toc241877253" w:history="1">
         <w:r>
           <w:rPr>
             <w:rStyle w:val="Hyperlink"/>
@@ -1019,7 +1019,7 @@
             <w:noProof/>
             <w:webHidden/>
           </w:rPr>
-          <w:instrText xml:space="preserve"> PAGEREF _Toc241869355 \h </w:instrText>
+          <w:instrText xml:space="preserve"> PAGEREF _Toc241877253 \h </w:instrText>
         </w:r>
         <w:r>
           <w:rPr>
@@ -1066,7 +1066,7 @@
           <w14:ligatures w14:val="standardContextual"/>
         </w:rPr>
       </w:pPr>
-      <w:hyperlink w:anchor="_Toc241869356" w:history="1">
+      <w:hyperlink w:anchor="_Toc241877254" w:history="1">
         <w:r>
           <w:rPr>
             <w:rStyle w:val="Hyperlink"/>
@@ -1093,7 +1093,7 @@
             <w:noProof/>
             <w:webHidden/>
           </w:rPr>
-          <w:instrText xml:space="preserve"> PAGEREF _Toc241869356 \h </w:instrText>
+          <w:instrText xml:space="preserve"> PAGEREF _Toc241877254 \h </w:instrText>
         </w:r>
         <w:r>
           <w:rPr>
@@ -1140,7 +1140,7 @@
           <w14:ligatures w14:val="standardContextual"/>
         </w:rPr>
       </w:pPr>
-      <w:hyperlink w:anchor="_Toc241869357" w:history="1">
+      <w:hyperlink w:anchor="_Toc241877255" w:history="1">
         <w:r>
           <w:rPr>
             <w:rStyle w:val="Hyperlink"/>
@@ -1167,7 +1167,7 @@
             <w:noProof/>
             <w:webHidden/>
           </w:rPr>
-          <w:instrText xml:space="preserve"> PAGEREF _Toc241869357 \h </w:instrText>
+          <w:instrText xml:space="preserve"> PAGEREF _Toc241877255 \h </w:instrText>
         </w:r>
         <w:r>
           <w:rPr>
@@ -1214,7 +1214,7 @@
           <w14:ligatures w14:val="standardContextual"/>
         </w:rPr>
       </w:pPr>
-      <w:hyperlink w:anchor="_Toc241869358" w:history="1">
+      <w:hyperlink w:anchor="_Toc241877256" w:history="1">
         <w:r>
           <w:rPr>
             <w:rStyle w:val="Hyperlink"/>
@@ -1241,7 +1241,7 @@
             <w:noProof/>
             <w:webHidden/>
           </w:rPr>
-          <w:instrText xml:space="preserve"> PAGEREF _Toc241869358 \h </w:instrText>
+          <w:instrText xml:space="preserve"> PAGEREF _Toc241877256 \h </w:instrText>
         </w:r>
         <w:r>
           <w:rPr>
@@ -1288,7 +1288,7 @@
           <w14:ligatures w14:val="standardContextual"/>
         </w:rPr>
       </w:pPr>
-      <w:hyperlink w:anchor="_Toc241869359" w:history="1">
+      <w:hyperlink w:anchor="_Toc241877257" w:history="1">
         <w:r>
           <w:rPr>
             <w:rStyle w:val="Hyperlink"/>
@@ -1315,7 +1315,7 @@
             <w:noProof/>
             <w:webHidden/>
           </w:rPr>
-          <w:instrText xml:space="preserve"> PAGEREF _Toc241869359 \h </w:instrText>
+          <w:instrText xml:space="preserve"> PAGEREF _Toc241877257 \h </w:instrText>
         </w:r>
         <w:r>
           <w:rPr>
@@ -1362,7 +1362,7 @@
           <w14:ligatures w14:val="standardContextual"/>
         </w:rPr>
       </w:pPr>
-      <w:hyperlink w:anchor="_Toc241869360" w:history="1">
+      <w:hyperlink w:anchor="_Toc241877258" w:history="1">
         <w:r>
           <w:rPr>
             <w:rStyle w:val="Hyperlink"/>
@@ -1389,7 +1389,7 @@
             <w:noProof/>
             <w:webHidden/>
           </w:rPr>
-          <w:instrText xml:space="preserve"> PAGEREF _Toc241869360 \h </w:instrText>
+          <w:instrText xml:space="preserve"> PAGEREF _Toc241877258 \h </w:instrText>
         </w:r>
         <w:r>
           <w:rPr>
@@ -1436,7 +1436,7 @@
           <w14:ligatures w14:val="standardContextual"/>
         </w:rPr>
       </w:pPr>
-      <w:hyperlink w:anchor="_Toc241869361" w:history="1">
+      <w:hyperlink w:anchor="_Toc241877259" w:history="1">
         <w:r>
           <w:rPr>
             <w:rStyle w:val="Hyperlink"/>
@@ -1463,7 +1463,7 @@
             <w:noProof/>
             <w:webHidden/>
           </w:rPr>
-          <w:instrText xml:space="preserve"> PAGEREF _Toc241869361 \h </w:instrText>
+          <w:instrText xml:space="preserve"> PAGEREF _Toc241877259 \h </w:instrText>
         </w:r>
         <w:r>
           <w:rPr>
@@ -1510,7 +1510,7 @@
           <w14:ligatures w14:val="standardContextual"/>
         </w:rPr>
       </w:pPr>
-      <w:hyperlink w:anchor="_Toc241869362" w:history="1">
+      <w:hyperlink w:anchor="_Toc241877260" w:history="1">
         <w:r>
           <w:rPr>
             <w:rStyle w:val="Hyperlink"/>
@@ -1537,7 +1537,7 @@
             <w:noProof/>
             <w:webHidden/>
           </w:rPr>
-          <w:instrText xml:space="preserve"> PAGEREF _Toc241869362 \h </w:instrText>
+          <w:instrText xml:space="preserve"> PAGEREF _Toc241877260 \h </w:instrText>
         </w:r>
         <w:r>
           <w:rPr>
@@ -1584,7 +1584,7 @@
           <w14:ligatures w14:val="standardContextual"/>
         </w:rPr>
       </w:pPr>
-      <w:hyperlink w:anchor="_Toc241869363" w:history="1">
+      <w:hyperlink w:anchor="_Toc241877261" w:history="1">
         <w:r>
           <w:rPr>
             <w:rStyle w:val="Hyperlink"/>
@@ -1611,7 +1611,7 @@
             <w:noProof/>
             <w:webHidden/>
           </w:rPr>
-          <w:instrText xml:space="preserve"> PAGEREF _Toc241869363 \h </w:instrText>
+          <w:instrText xml:space="preserve"> PAGEREF _Toc241877261 \h </w:instrText>
         </w:r>
         <w:r>
           <w:rPr>
@@ -1658,7 +1658,7 @@
           <w14:ligatures w14:val="standardContextual"/>
         </w:rPr>
       </w:pPr>
-      <w:hyperlink w:anchor="_Toc241869364" w:history="1">
+      <w:hyperlink w:anchor="_Toc241877262" w:history="1">
         <w:r>
           <w:rPr>
             <w:rStyle w:val="Hyperlink"/>
@@ -1685,7 +1685,7 @@
             <w:noProof/>
             <w:webHidden/>
           </w:rPr>
-          <w:instrText xml:space="preserve"> PAGEREF _Toc241869364 \h </w:instrText>
+          <w:instrText xml:space="preserve"> PAGEREF _Toc241877262 \h </w:instrText>
         </w:r>
         <w:r>
           <w:rPr>
@@ -1732,7 +1732,7 @@
           <w14:ligatures w14:val="standardContextual"/>
         </w:rPr>
       </w:pPr>
-      <w:hyperlink w:anchor="_Toc241869365" w:history="1">
+      <w:hyperlink w:anchor="_Toc241877263" w:history="1">
         <w:r>
           <w:rPr>
             <w:rStyle w:val="Hyperlink"/>
@@ -1759,7 +1759,7 @@
             <w:noProof/>
             <w:webHidden/>
           </w:rPr>
-          <w:instrText xml:space="preserve"> PAGEREF _Toc241869365 \h </w:instrText>
+          <w:instrText xml:space="preserve"> PAGEREF _Toc241877263 \h </w:instrText>
         </w:r>
         <w:r>
           <w:rPr>
@@ -1806,7 +1806,7 @@
           <w14:ligatures w14:val="standardContextual"/>
         </w:rPr>
       </w:pPr>
-      <w:hyperlink w:anchor="_Toc241869366" w:history="1">
+      <w:hyperlink w:anchor="_Toc241877264" w:history="1">
         <w:r>
           <w:rPr>
             <w:rStyle w:val="Hyperlink"/>
@@ -1833,7 +1833,7 @@
             <w:noProof/>
             <w:webHidden/>
           </w:rPr>
-          <w:instrText xml:space="preserve"> PAGEREF _Toc241869366 \h </w:instrText>
+          <w:instrText xml:space="preserve"> PAGEREF _Toc241877264 \h </w:instrText>
         </w:r>
         <w:r>
           <w:rPr>
@@ -1880,7 +1880,7 @@
           <w14:ligatures w14:val="standardContextual"/>
         </w:rPr>
       </w:pPr>
-      <w:hyperlink w:anchor="_Toc241869367" w:history="1">
+      <w:hyperlink w:anchor="_Toc241877265" w:history="1">
         <w:r>
           <w:rPr>
             <w:rStyle w:val="Hyperlink"/>
@@ -1907,7 +1907,7 @@
             <w:noProof/>
             <w:webHidden/>
           </w:rPr>
-          <w:instrText xml:space="preserve"> PAGEREF _Toc241869367 \h </w:instrText>
+          <w:instrText xml:space="preserve"> PAGEREF _Toc241877265 \h </w:instrText>
         </w:r>
         <w:r>
           <w:rPr>
@@ -1954,7 +1954,7 @@
           <w14:ligatures w14:val="standardContextual"/>
         </w:rPr>
       </w:pPr>
-      <w:hyperlink w:anchor="_Toc241869368" w:history="1">
+      <w:hyperlink w:anchor="_Toc241877266" w:history="1">
         <w:r>
           <w:rPr>
             <w:rStyle w:val="Hyperlink"/>
@@ -1981,7 +1981,7 @@
             <w:noProof/>
             <w:webHidden/>
           </w:rPr>
-          <w:instrText xml:space="preserve"> PAGEREF _Toc241869368 \h </w:instrText>
+          <w:instrText xml:space="preserve"> PAGEREF _Toc241877266 \h </w:instrText>
         </w:r>
         <w:r>
           <w:rPr>
@@ -2028,7 +2028,7 @@
           <w14:ligatures w14:val="standardContextual"/>
         </w:rPr>
       </w:pPr>
-      <w:hyperlink w:anchor="_Toc241869369" w:history="1">
+      <w:hyperlink w:anchor="_Toc241877267" w:history="1">
         <w:r>
           <w:rPr>
             <w:rStyle w:val="Hyperlink"/>
@@ -2055,7 +2055,7 @@
             <w:noProof/>
             <w:webHidden/>
           </w:rPr>
-          <w:instrText xml:space="preserve"> PAGEREF _Toc241869369 \h </w:instrText>
+          <w:instrText xml:space="preserve"> PAGEREF _Toc241877267 \h </w:instrText>
         </w:r>
         <w:r>
           <w:rPr>
@@ -2102,7 +2102,7 @@
           <w14:ligatures w14:val="standardContextual"/>
         </w:rPr>
       </w:pPr>
-      <w:hyperlink w:anchor="_Toc241869370" w:history="1">
+      <w:hyperlink w:anchor="_Toc241877268" w:history="1">
         <w:r>
           <w:rPr>
             <w:rStyle w:val="Hyperlink"/>
@@ -2129,7 +2129,7 @@
             <w:noProof/>
             <w:webHidden/>
           </w:rPr>
-          <w:instrText xml:space="preserve"> PAGEREF _Toc241869370 \h </w:instrText>
+          <w:instrText xml:space="preserve"> PAGEREF _Toc241877268 \h </w:instrText>
         </w:r>
         <w:r>
           <w:rPr>
@@ -2176,7 +2176,7 @@
           <w14:ligatures w14:val="standardContextual"/>
         </w:rPr>
       </w:pPr>
-      <w:hyperlink w:anchor="_Toc241869371" w:history="1">
+      <w:hyperlink w:anchor="_Toc241877269" w:history="1">
         <w:r>
           <w:rPr>
             <w:rStyle w:val="Hyperlink"/>
@@ -2203,7 +2203,7 @@
             <w:noProof/>
             <w:webHidden/>
           </w:rPr>
-          <w:instrText xml:space="preserve"> PAGEREF _Toc241869371 \h </w:instrText>
+          <w:instrText xml:space="preserve"> PAGEREF _Toc241877269 \h </w:instrText>
         </w:r>
         <w:r>
           <w:rPr>
@@ -2250,7 +2250,7 @@
           <w14:ligatures w14:val="standardContextual"/>
         </w:rPr>
       </w:pPr>
-      <w:hyperlink w:anchor="_Toc241869372" w:history="1">
+      <w:hyperlink w:anchor="_Toc241877270" w:history="1">
         <w:r>
           <w:rPr>
             <w:rStyle w:val="Hyperlink"/>
@@ -2277,7 +2277,7 @@
             <w:noProof/>
             <w:webHidden/>
           </w:rPr>
-          <w:instrText xml:space="preserve"> PAGEREF _Toc241869372 \h </w:instrText>
+          <w:instrText xml:space="preserve"> PAGEREF _Toc241877270 \h </w:instrText>
         </w:r>
         <w:r>
           <w:rPr>
@@ -2324,7 +2324,7 @@
           <w14:ligatures w14:val="standardContextual"/>
         </w:rPr>
       </w:pPr>
-      <w:hyperlink w:anchor="_Toc241869373" w:history="1">
+      <w:hyperlink w:anchor="_Toc241877271" w:history="1">
         <w:r>
           <w:rPr>
             <w:rStyle w:val="Hyperlink"/>
@@ -2351,7 +2351,7 @@
             <w:noProof/>
             <w:webHidden/>
           </w:rPr>
-          <w:instrText xml:space="preserve"> PAGEREF _Toc241869373 \h </w:instrText>
+          <w:instrText xml:space="preserve"> PAGEREF _Toc241877271 \h </w:instrText>
         </w:r>
         <w:r>
           <w:rPr>
@@ -2398,7 +2398,7 @@
           <w14:ligatures w14:val="standardContextual"/>
         </w:rPr>
       </w:pPr>
-      <w:hyperlink w:anchor="_Toc241869374" w:history="1">
+      <w:hyperlink w:anchor="_Toc241877272" w:history="1">
         <w:r>
           <w:rPr>
             <w:rStyle w:val="Hyperlink"/>
@@ -2425,7 +2425,7 @@
             <w:noProof/>
             <w:webHidden/>
           </w:rPr>
-          <w:instrText xml:space="preserve"> PAGEREF _Toc241869374 \h </w:instrText>
+          <w:instrText xml:space="preserve"> PAGEREF _Toc241877272 \h </w:instrText>
         </w:r>
         <w:r>
           <w:rPr>
@@ -2472,7 +2472,7 @@
           <w14:ligatures w14:val="standardContextual"/>
         </w:rPr>
       </w:pPr>
-      <w:hyperlink w:anchor="_Toc241869375" w:history="1">
+      <w:hyperlink w:anchor="_Toc241877273" w:history="1">
         <w:r>
           <w:rPr>
             <w:rStyle w:val="Hyperlink"/>
@@ -2499,7 +2499,7 @@
             <w:noProof/>
             <w:webHidden/>
           </w:rPr>
-          <w:instrText xml:space="preserve"> PAGEREF _Toc241869375 \h </w:instrText>
+          <w:instrText xml:space="preserve"> PAGEREF _Toc241877273 \h </w:instrText>
         </w:r>
         <w:r>
           <w:rPr>
@@ -2546,7 +2546,7 @@
           <w14:ligatures w14:val="standardContextual"/>
         </w:rPr>
       </w:pPr>
-      <w:hyperlink w:anchor="_Toc241869376" w:history="1">
+      <w:hyperlink w:anchor="_Toc241877274" w:history="1">
         <w:r>
           <w:rPr>
             <w:rStyle w:val="Hyperlink"/>
@@ -2573,7 +2573,7 @@
             <w:noProof/>
             <w:webHidden/>
           </w:rPr>
-          <w:instrText xml:space="preserve"> PAGEREF _Toc241869376 \h </w:instrText>
+          <w:instrText xml:space="preserve"> PAGEREF _Toc241877274 \h </w:instrText>
         </w:r>
         <w:r>
           <w:rPr>
@@ -2620,7 +2620,7 @@
           <w14:ligatures w14:val="standardContextual"/>
         </w:rPr>
       </w:pPr>
-      <w:hyperlink w:anchor="_Toc241869377" w:history="1">
+      <w:hyperlink w:anchor="_Toc241877275" w:history="1">
         <w:r>
           <w:rPr>
             <w:rStyle w:val="Hyperlink"/>
@@ -2647,7 +2647,7 @@
             <w:noProof/>
             <w:webHidden/>
           </w:rPr>
-          <w:instrText xml:space="preserve"> PAGEREF _Toc241869377 \h </w:instrText>
+          <w:instrText xml:space="preserve"> PAGEREF _Toc241877275 \h </w:instrText>
         </w:r>
         <w:r>
           <w:rPr>
@@ -2694,7 +2694,7 @@
           <w14:ligatures w14:val="standardContextual"/>
         </w:rPr>
       </w:pPr>
-      <w:hyperlink w:anchor="_Toc241869378" w:history="1">
+      <w:hyperlink w:anchor="_Toc241877276" w:history="1">
         <w:r>
           <w:rPr>
             <w:rStyle w:val="Hyperlink"/>
@@ -2721,7 +2721,7 @@
             <w:noProof/>
             <w:webHidden/>
           </w:rPr>
-          <w:instrText xml:space="preserve"> PAGEREF _Toc241869378 \h </w:instrText>
+          <w:instrText xml:space="preserve"> PAGEREF _Toc241877276 \h </w:instrText>
         </w:r>
         <w:r>
           <w:rPr>
@@ -2768,7 +2768,7 @@
           <w14:ligatures w14:val="standardContextual"/>
         </w:rPr>
       </w:pPr>
-      <w:hyperlink w:anchor="_Toc241869379" w:history="1">
+      <w:hyperlink w:anchor="_Toc241877277" w:history="1">
         <w:r>
           <w:rPr>
             <w:rStyle w:val="Hyperlink"/>
@@ -2795,7 +2795,7 @@
             <w:noProof/>
             <w:webHidden/>
           </w:rPr>
-          <w:instrText xml:space="preserve"> PAGEREF _Toc241869379 \h </w:instrText>
+          <w:instrText xml:space="preserve"> PAGEREF _Toc241877277 \h </w:instrText>
         </w:r>
         <w:r>
           <w:rPr>
@@ -2842,7 +2842,7 @@
           <w14:ligatures w14:val="standardContextual"/>
         </w:rPr>
       </w:pPr>
-      <w:hyperlink w:anchor="_Toc241869380" w:history="1">
+      <w:hyperlink w:anchor="_Toc241877278" w:history="1">
         <w:r>
           <w:rPr>
             <w:rStyle w:val="Hyperlink"/>
@@ -2869,7 +2869,7 @@
             <w:noProof/>
             <w:webHidden/>
           </w:rPr>
-          <w:instrText xml:space="preserve"> PAGEREF _Toc241869380 \h </w:instrText>
+          <w:instrText xml:space="preserve"> PAGEREF _Toc241877278 \h </w:instrText>
         </w:r>
         <w:r>
           <w:rPr>
@@ -2916,7 +2916,7 @@
           <w14:ligatures w14:val="standardContextual"/>
         </w:rPr>
       </w:pPr>
-      <w:hyperlink w:anchor="_Toc241869381" w:history="1">
+      <w:hyperlink w:anchor="_Toc241877279" w:history="1">
         <w:r>
           <w:rPr>
             <w:rStyle w:val="Hyperlink"/>
@@ -2943,7 +2943,7 @@
             <w:noProof/>
             <w:webHidden/>
           </w:rPr>
-          <w:instrText xml:space="preserve"> PAGEREF _Toc241869381 \h </w:instrText>
+          <w:instrText xml:space="preserve"> PAGEREF _Toc241877279 \h </w:instrText>
         </w:r>
         <w:r>
           <w:rPr>
@@ -2990,7 +2990,7 @@
           <w14:ligatures w14:val="standardContextual"/>
         </w:rPr>
       </w:pPr>
-      <w:hyperlink w:anchor="_Toc241869382" w:history="1">
+      <w:hyperlink w:anchor="_Toc241877280" w:history="1">
         <w:r>
           <w:rPr>
             <w:rStyle w:val="Hyperlink"/>
@@ -3017,7 +3017,7 @@
             <w:noProof/>
             <w:webHidden/>
           </w:rPr>
-          <w:instrText xml:space="preserve"> PAGEREF _Toc241869382 \h </w:instrText>
+          <w:instrText xml:space="preserve"> PAGEREF _Toc241877280 \h </w:instrText>
         </w:r>
         <w:r>
           <w:rPr>
@@ -3064,7 +3064,7 @@
           <w14:ligatures w14:val="standardContextual"/>
         </w:rPr>
       </w:pPr>
-      <w:hyperlink w:anchor="_Toc241869383" w:history="1">
+      <w:hyperlink w:anchor="_Toc241877281" w:history="1">
         <w:r>
           <w:rPr>
             <w:rStyle w:val="Hyperlink"/>
@@ -3091,7 +3091,7 @@
             <w:noProof/>
             <w:webHidden/>
           </w:rPr>
-          <w:instrText xml:space="preserve"> PAGEREF _Toc241869383 \h </w:instrText>
+          <w:instrText xml:space="preserve"> PAGEREF _Toc241877281 \h </w:instrText>
         </w:r>
         <w:r>
           <w:rPr>
@@ -3138,7 +3138,7 @@
           <w14:ligatures w14:val="standardContextual"/>
         </w:rPr>
       </w:pPr>
-      <w:hyperlink w:anchor="_Toc241869384" w:history="1">
+      <w:hyperlink w:anchor="_Toc241877282" w:history="1">
         <w:r>
           <w:rPr>
             <w:rStyle w:val="Hyperlink"/>
@@ -3165,7 +3165,7 @@
             <w:noProof/>
             <w:webHidden/>
           </w:rPr>
-          <w:instrText xml:space="preserve"> PAGEREF _Toc241869384 \h </w:instrText>
+          <w:instrText xml:space="preserve"> PAGEREF _Toc241877282 \h </w:instrText>
         </w:r>
         <w:r>
           <w:rPr>
@@ -3212,7 +3212,7 @@
           <w14:ligatures w14:val="standardContextual"/>
         </w:rPr>
       </w:pPr>
-      <w:hyperlink w:anchor="_Toc241869385" w:history="1">
+      <w:hyperlink w:anchor="_Toc241877283" w:history="1">
         <w:r>
           <w:rPr>
             <w:rStyle w:val="Hyperlink"/>
@@ -3239,7 +3239,7 @@
             <w:noProof/>
             <w:webHidden/>
           </w:rPr>
-          <w:instrText xml:space="preserve"> PAGEREF _Toc241869385 \h </w:instrText>
+          <w:instrText xml:space="preserve"> PAGEREF _Toc241877283 \h </w:instrText>
         </w:r>
         <w:r>
           <w:rPr>
@@ -3286,7 +3286,7 @@
           <w14:ligatures w14:val="standardContextual"/>
         </w:rPr>
       </w:pPr>
-      <w:hyperlink w:anchor="_Toc241869386" w:history="1">
+      <w:hyperlink w:anchor="_Toc241877284" w:history="1">
         <w:r>
           <w:rPr>
             <w:rStyle w:val="Hyperlink"/>
@@ -3313,7 +3313,7 @@
             <w:noProof/>
             <w:webHidden/>
           </w:rPr>
-          <w:instrText xml:space="preserve"> PAGEREF _Toc241869386 \h </w:instrText>
+          <w:instrText xml:space="preserve"> PAGEREF _Toc241877284 \h </w:instrText>
         </w:r>
         <w:r>
           <w:rPr>
@@ -3360,7 +3360,7 @@
           <w14:ligatures w14:val="standardContextual"/>
         </w:rPr>
       </w:pPr>
-      <w:hyperlink w:anchor="_Toc241869387" w:history="1">
+      <w:hyperlink w:anchor="_Toc241877285" w:history="1">
         <w:r>
           <w:rPr>
             <w:rStyle w:val="Hyperlink"/>
@@ -3387,7 +3387,7 @@
             <w:noProof/>
             <w:webHidden/>
           </w:rPr>
-          <w:instrText xml:space="preserve"> PAGEREF _Toc241869387 \h </w:instrText>
+          <w:instrText xml:space="preserve"> PAGEREF _Toc241877285 \h </w:instrText>
         </w:r>
         <w:r>
           <w:rPr>
@@ -3434,7 +3434,7 @@
           <w14:ligatures w14:val="standardContextual"/>
         </w:rPr>
       </w:pPr>
-      <w:hyperlink w:anchor="_Toc241869388" w:history="1">
+      <w:hyperlink w:anchor="_Toc241877286" w:history="1">
         <w:r>
           <w:rPr>
             <w:rStyle w:val="Hyperlink"/>
@@ -3461,7 +3461,7 @@
             <w:noProof/>
             <w:webHidden/>
           </w:rPr>
-          <w:instrText xml:space="preserve"> PAGEREF _Toc241869388 \h </w:instrText>
+          <w:instrText xml:space="preserve"> PAGEREF _Toc241877286 \h </w:instrText>
         </w:r>
         <w:r>
           <w:rPr>
@@ -3508,7 +3508,7 @@
           <w14:ligatures w14:val="standardContextual"/>
         </w:rPr>
       </w:pPr>
-      <w:hyperlink w:anchor="_Toc241869389" w:history="1">
+      <w:hyperlink w:anchor="_Toc241877287" w:history="1">
         <w:r>
           <w:rPr>
             <w:rStyle w:val="Hyperlink"/>
@@ -3535,7 +3535,7 @@
             <w:noProof/>
             <w:webHidden/>
           </w:rPr>
-          <w:instrText xml:space="preserve"> PAGEREF _Toc241869389 \h </w:instrText>
+          <w:instrText xml:space="preserve"> PAGEREF _Toc241877287 \h </w:instrText>
         </w:r>
         <w:r>
           <w:rPr>
@@ -3582,7 +3582,7 @@
           <w14:ligatures w14:val="standardContextual"/>
         </w:rPr>
       </w:pPr>
-      <w:hyperlink w:anchor="_Toc241869390" w:history="1">
+      <w:hyperlink w:anchor="_Toc241877288" w:history="1">
         <w:r>
           <w:rPr>
             <w:rStyle w:val="Hyperlink"/>
@@ -3609,7 +3609,7 @@
             <w:noProof/>
             <w:webHidden/>
           </w:rPr>
-          <w:instrText xml:space="preserve"> PAGEREF _Toc241869390 \h </w:instrText>
+          <w:instrText xml:space="preserve"> PAGEREF _Toc241877288 \h </w:instrText>
         </w:r>
         <w:r>
           <w:rPr>
@@ -3656,7 +3656,7 @@
           <w14:ligatures w14:val="standardContextual"/>
         </w:rPr>
       </w:pPr>
-      <w:hyperlink w:anchor="_Toc241869391" w:history="1">
+      <w:hyperlink w:anchor="_Toc241877289" w:history="1">
         <w:r>
           <w:rPr>
             <w:rStyle w:val="Hyperlink"/>
@@ -3683,7 +3683,7 @@
             <w:noProof/>
             <w:webHidden/>
           </w:rPr>
-          <w:instrText xml:space="preserve"> PAGEREF _Toc241869391 \h </w:instrText>
+          <w:instrText xml:space="preserve"> PAGEREF _Toc241877289 \h </w:instrText>
         </w:r>
         <w:r>
           <w:rPr>
@@ -3730,7 +3730,7 @@
           <w14:ligatures w14:val="standardContextual"/>
         </w:rPr>
       </w:pPr>
-      <w:hyperlink w:anchor="_Toc241869392" w:history="1">
+      <w:hyperlink w:anchor="_Toc241877290" w:history="1">
         <w:r>
           <w:rPr>
             <w:rStyle w:val="Hyperlink"/>
@@ -3757,7 +3757,7 @@
             <w:noProof/>
             <w:webHidden/>
           </w:rPr>
-          <w:instrText xml:space="preserve"> PAGEREF _Toc241869392 \h </w:instrText>
+          <w:instrText xml:space="preserve"> PAGEREF _Toc241877290 \h </w:instrText>
         </w:r>
         <w:r>
           <w:rPr>
@@ -3804,7 +3804,7 @@
           <w14:ligatures w14:val="standardContextual"/>
         </w:rPr>
       </w:pPr>
-      <w:hyperlink w:anchor="_Toc241869393" w:history="1">
+      <w:hyperlink w:anchor="_Toc241877291" w:history="1">
         <w:r>
           <w:rPr>
             <w:rStyle w:val="Hyperlink"/>
@@ -3831,7 +3831,7 @@
             <w:noProof/>
             <w:webHidden/>
           </w:rPr>
-          <w:instrText xml:space="preserve"> PAGEREF _Toc241869393 \h </w:instrText>
+          <w:instrText xml:space="preserve"> PAGEREF _Toc241877291 \h </w:instrText>
         </w:r>
         <w:r>
           <w:rPr>
@@ -3878,7 +3878,7 @@
           <w14:ligatures w14:val="standardContextual"/>
         </w:rPr>
       </w:pPr>
-      <w:hyperlink w:anchor="_Toc241869394" w:history="1">
+      <w:hyperlink w:anchor="_Toc241877292" w:history="1">
         <w:r>
           <w:rPr>
             <w:rStyle w:val="Hyperlink"/>
@@ -3905,7 +3905,7 @@
             <w:noProof/>
             <w:webHidden/>
           </w:rPr>
-          <w:instrText xml:space="preserve"> PAGEREF _Toc241869394 \h </w:instrText>
+          <w:instrText xml:space="preserve"> PAGEREF _Toc241877292 \h </w:instrText>
         </w:r>
         <w:r>
           <w:rPr>
@@ -3952,7 +3952,7 @@
           <w14:ligatures w14:val="standardContextual"/>
         </w:rPr>
       </w:pPr>
-      <w:hyperlink w:anchor="_Toc241869395" w:history="1">
+      <w:hyperlink w:anchor="_Toc241877293" w:history="1">
         <w:r>
           <w:rPr>
             <w:rStyle w:val="Hyperlink"/>
@@ -3979,7 +3979,7 @@
             <w:noProof/>
             <w:webHidden/>
           </w:rPr>
-          <w:instrText xml:space="preserve"> PAGEREF _Toc241869395 \h </w:instrText>
+          <w:instrText xml:space="preserve"> PAGEREF _Toc241877293 \h </w:instrText>
         </w:r>
         <w:r>
           <w:rPr>
@@ -4026,7 +4026,7 @@
           <w14:ligatures w14:val="standardContextual"/>
         </w:rPr>
       </w:pPr>
-      <w:hyperlink w:anchor="_Toc241869396" w:history="1">
+      <w:hyperlink w:anchor="_Toc241877294" w:history="1">
         <w:r>
           <w:rPr>
             <w:rStyle w:val="Hyperlink"/>
@@ -4053,7 +4053,7 @@
             <w:noProof/>
             <w:webHidden/>
           </w:rPr>
-          <w:instrText xml:space="preserve"> PAGEREF _Toc241869396 \h </w:instrText>
+          <w:instrText xml:space="preserve"> PAGEREF _Toc241877294 \h </w:instrText>
         </w:r>
         <w:r>
           <w:rPr>
@@ -4100,7 +4100,7 @@
           <w14:ligatures w14:val="standardContextual"/>
         </w:rPr>
       </w:pPr>
-      <w:hyperlink w:anchor="_Toc241869397" w:history="1">
+      <w:hyperlink w:anchor="_Toc241877295" w:history="1">
         <w:r>
           <w:rPr>
             <w:rStyle w:val="Hyperlink"/>
@@ -4127,7 +4127,7 @@
             <w:noProof/>
             <w:webHidden/>
           </w:rPr>
-          <w:instrText xml:space="preserve"> PAGEREF _Toc241869397 \h </w:instrText>
+          <w:instrText xml:space="preserve"> PAGEREF _Toc241877295 \h </w:instrText>
         </w:r>
         <w:r>
           <w:rPr>
@@ -4174,7 +4174,7 @@
           <w14:ligatures w14:val="standardContextual"/>
         </w:rPr>
       </w:pPr>
-      <w:hyperlink w:anchor="_Toc241869398" w:history="1">
+      <w:hyperlink w:anchor="_Toc241877296" w:history="1">
         <w:r>
           <w:rPr>
             <w:rStyle w:val="Hyperlink"/>
@@ -4201,7 +4201,7 @@
             <w:noProof/>
             <w:webHidden/>
           </w:rPr>
-          <w:instrText xml:space="preserve"> PAGEREF _Toc241869398 \h </w:instrText>
+          <w:instrText xml:space="preserve"> PAGEREF _Toc241877296 \h </w:instrText>
         </w:r>
         <w:r>
           <w:rPr>
@@ -4248,7 +4248,7 @@
           <w14:ligatures w14:val="standardContextual"/>
         </w:rPr>
       </w:pPr>
-      <w:hyperlink w:anchor="_Toc241869399" w:history="1">
+      <w:hyperlink w:anchor="_Toc241877297" w:history="1">
         <w:r>
           <w:rPr>
             <w:rStyle w:val="Hyperlink"/>
@@ -4275,7 +4275,7 @@
             <w:noProof/>
             <w:webHidden/>
           </w:rPr>
-          <w:instrText xml:space="preserve"> PAGEREF _Toc241869399 \h </w:instrText>
+          <w:instrText xml:space="preserve"> PAGEREF _Toc241877297 \h </w:instrText>
         </w:r>
         <w:r>
           <w:rPr>
@@ -4322,7 +4322,7 @@
           <w14:ligatures w14:val="standardContextual"/>
         </w:rPr>
       </w:pPr>
-      <w:hyperlink w:anchor="_Toc241869400" w:history="1">
+      <w:hyperlink w:anchor="_Toc241877298" w:history="1">
         <w:r>
           <w:rPr>
             <w:rStyle w:val="Hyperlink"/>
@@ -4349,7 +4349,7 @@
             <w:noProof/>
             <w:webHidden/>
           </w:rPr>
-          <w:instrText xml:space="preserve"> PAGEREF _Toc241869400 \h </w:instrText>
+          <w:instrText xml:space="preserve"> PAGEREF _Toc241877298 \h </w:instrText>
         </w:r>
         <w:r>
           <w:rPr>
@@ -4396,7 +4396,7 @@
           <w14:ligatures w14:val="standardContextual"/>
         </w:rPr>
       </w:pPr>
-      <w:hyperlink w:anchor="_Toc241869401" w:history="1">
+      <w:hyperlink w:anchor="_Toc241877299" w:history="1">
         <w:r>
           <w:rPr>
             <w:rStyle w:val="Hyperlink"/>
@@ -4423,7 +4423,7 @@
             <w:noProof/>
             <w:webHidden/>
           </w:rPr>
-          <w:instrText xml:space="preserve"> PAGEREF _Toc241869401 \h </w:instrText>
+          <w:instrText xml:space="preserve"> PAGEREF _Toc241877299 \h </w:instrText>
         </w:r>
         <w:r>
           <w:rPr>
@@ -4470,7 +4470,7 @@
           <w14:ligatures w14:val="standardContextual"/>
         </w:rPr>
       </w:pPr>
-      <w:hyperlink w:anchor="_Toc241869402" w:history="1">
+      <w:hyperlink w:anchor="_Toc241877300" w:history="1">
         <w:r>
           <w:rPr>
             <w:rStyle w:val="Hyperlink"/>
@@ -4497,7 +4497,7 @@
             <w:noProof/>
             <w:webHidden/>
           </w:rPr>
-          <w:instrText xml:space="preserve"> PAGEREF _Toc241869402 \h </w:instrText>
+          <w:instrText xml:space="preserve"> PAGEREF _Toc241877300 \h </w:instrText>
         </w:r>
         <w:r>
           <w:rPr>
@@ -4544,7 +4544,7 @@
           <w14:ligatures w14:val="standardContextual"/>
         </w:rPr>
       </w:pPr>
-      <w:hyperlink w:anchor="_Toc241869403" w:history="1">
+      <w:hyperlink w:anchor="_Toc241877301" w:history="1">
         <w:r>
           <w:rPr>
             <w:rStyle w:val="Hyperlink"/>
@@ -4571,7 +4571,7 @@
             <w:noProof/>
             <w:webHidden/>
           </w:rPr>
-          <w:instrText xml:space="preserve"> PAGEREF _Toc241869403 \h </w:instrText>
+          <w:instrText xml:space="preserve"> PAGEREF _Toc241877301 \h </w:instrText>
         </w:r>
         <w:r>
           <w:rPr>
@@ -4618,7 +4618,7 @@
           <w14:ligatures w14:val="standardContextual"/>
         </w:rPr>
       </w:pPr>
-      <w:hyperlink w:anchor="_Toc241869404" w:history="1">
+      <w:hyperlink w:anchor="_Toc241877302" w:history="1">
         <w:r>
           <w:rPr>
             <w:rStyle w:val="Hyperlink"/>
@@ -4645,7 +4645,7 @@
             <w:noProof/>
             <w:webHidden/>
           </w:rPr>
-          <w:instrText xml:space="preserve"> PAGEREF _Toc241869404 \h </w:instrText>
+          <w:instrText xml:space="preserve"> PAGEREF _Toc241877302 \h </w:instrText>
         </w:r>
         <w:r>
           <w:rPr>
@@ -4692,7 +4692,7 @@
           <w14:ligatures w14:val="standardContextual"/>
         </w:rPr>
       </w:pPr>
-      <w:hyperlink w:anchor="_Toc241869405" w:history="1">
+      <w:hyperlink w:anchor="_Toc241877303" w:history="1">
         <w:r>
           <w:rPr>
             <w:rStyle w:val="Hyperlink"/>
@@ -4719,7 +4719,7 @@
             <w:noProof/>
             <w:webHidden/>
           </w:rPr>
-          <w:instrText xml:space="preserve"> PAGEREF _Toc241869405 \h </w:instrText>
+          <w:instrText xml:space="preserve"> PAGEREF _Toc241877303 \h </w:instrText>
         </w:r>
         <w:r>
           <w:rPr>
@@ -4766,7 +4766,7 @@
           <w14:ligatures w14:val="standardContextual"/>
         </w:rPr>
       </w:pPr>
-      <w:hyperlink w:anchor="_Toc241869406" w:history="1">
+      <w:hyperlink w:anchor="_Toc241877304" w:history="1">
         <w:r>
           <w:rPr>
             <w:rStyle w:val="Hyperlink"/>
@@ -4793,7 +4793,7 @@
             <w:noProof/>
             <w:webHidden/>
           </w:rPr>
-          <w:instrText xml:space="preserve"> PAGEREF _Toc241869406 \h </w:instrText>
+          <w:instrText xml:space="preserve"> PAGEREF _Toc241877304 \h </w:instrText>
         </w:r>
         <w:r>
           <w:rPr>
@@ -4840,7 +4840,7 @@
           <w14:ligatures w14:val="standardContextual"/>
         </w:rPr>
       </w:pPr>
-      <w:hyperlink w:anchor="_Toc241869407" w:history="1">
+      <w:hyperlink w:anchor="_Toc241877305" w:history="1">
         <w:r>
           <w:rPr>
             <w:rStyle w:val="Hyperlink"/>
@@ -4867,7 +4867,7 @@
             <w:noProof/>
             <w:webHidden/>
           </w:rPr>
-          <w:instrText xml:space="preserve"> PAGEREF _Toc241869407 \h </w:instrText>
+          <w:instrText xml:space="preserve"> PAGEREF _Toc241877305 \h </w:instrText>
         </w:r>
         <w:r>
           <w:rPr>
@@ -4914,7 +4914,7 @@
           <w14:ligatures w14:val="standardContextual"/>
         </w:rPr>
       </w:pPr>
-      <w:hyperlink w:anchor="_Toc241869408" w:history="1">
+      <w:hyperlink w:anchor="_Toc241877306" w:history="1">
         <w:r>
           <w:rPr>
             <w:rStyle w:val="Hyperlink"/>
@@ -4941,7 +4941,7 @@
             <w:noProof/>
             <w:webHidden/>
           </w:rPr>
-          <w:instrText xml:space="preserve"> PAGEREF _Toc241869408 \h </w:instrText>
+          <w:instrText xml:space="preserve"> PAGEREF _Toc241877306 \h </w:instrText>
         </w:r>
         <w:r>
           <w:rPr>
@@ -4988,7 +4988,7 @@
           <w14:ligatures w14:val="standardContextual"/>
         </w:rPr>
       </w:pPr>
-      <w:hyperlink w:anchor="_Toc241869409" w:history="1">
+      <w:hyperlink w:anchor="_Toc241877307" w:history="1">
         <w:r>
           <w:rPr>
             <w:rStyle w:val="Hyperlink"/>
@@ -5015,7 +5015,7 @@
             <w:noProof/>
             <w:webHidden/>
           </w:rPr>
-          <w:instrText xml:space="preserve"> PAGEREF _Toc241869409 \h </w:instrText>
+          <w:instrText xml:space="preserve"> PAGEREF _Toc241877307 \h </w:instrText>
         </w:r>
         <w:r>
           <w:rPr>
@@ -5062,7 +5062,7 @@
           <w14:ligatures w14:val="standardContextual"/>
         </w:rPr>
       </w:pPr>
-      <w:hyperlink w:anchor="_Toc241869410" w:history="1">
+      <w:hyperlink w:anchor="_Toc241877308" w:history="1">
         <w:r>
           <w:rPr>
             <w:rStyle w:val="Hyperlink"/>
@@ -5089,7 +5089,7 @@
             <w:noProof/>
             <w:webHidden/>
           </w:rPr>
-          <w:instrText xml:space="preserve"> PAGEREF _Toc241869410 \h </w:instrText>
+          <w:instrText xml:space="preserve"> PAGEREF _Toc241877308 \h </w:instrText>
         </w:r>
         <w:r>
           <w:rPr>
@@ -5130,7 +5130,7 @@
         <w:pStyle w:val="Heading1"/>
         <w:pageBreakBefore/>
       </w:pPr>
-      <w:bookmarkStart w:id="0" w:name="_Toc241869348"/>
+      <w:bookmarkStart w:id="0" w:name="_Toc241877246"/>
       <w:r>
         <w:lastRenderedPageBreak/>
         <w:t>About this document</w:t>
@@ -5149,7 +5149,7 @@
       <w:pPr>
         <w:pStyle w:val="Heading2"/>
       </w:pPr>
-      <w:bookmarkStart w:id="1" w:name="_Toc241869349"/>
+      <w:bookmarkStart w:id="1" w:name="_Toc241877247"/>
       <w:r>
         <w:t>Names used in this document</w:t>
       </w:r>
@@ -5418,7 +5418,7 @@
       <w:pPr>
         <w:pStyle w:val="Heading2"/>
       </w:pPr>
-      <w:bookmarkStart w:id="2" w:name="_Toc241869350"/>
+      <w:bookmarkStart w:id="2" w:name="_Toc241877248"/>
       <w:r>
         <w:t>Screenshots</w:t>
       </w:r>
@@ -5451,7 +5451,7 @@
       <w:pPr>
         <w:pStyle w:val="Heading1"/>
       </w:pPr>
-      <w:bookmarkStart w:id="3" w:name="_Toc241869351"/>
+      <w:bookmarkStart w:id="3" w:name="_Toc241877249"/>
       <w:r>
         <w:t>1. Overview</w:t>
       </w:r>
@@ -5461,7 +5461,7 @@
       <w:pPr>
         <w:pStyle w:val="Heading2"/>
       </w:pPr>
-      <w:bookmarkStart w:id="4" w:name="_Toc241869352"/>
+      <w:bookmarkStart w:id="4" w:name="_Toc241877250"/>
       <w:r>
         <w:t>1.1 What the control does</w:t>
       </w:r>
@@ -5592,7 +5592,7 @@
       <w:pPr>
         <w:pStyle w:val="Heading2"/>
       </w:pPr>
-      <w:bookmarkStart w:id="5" w:name="_Toc241869353"/>
+      <w:bookmarkStart w:id="5" w:name="_Toc241877251"/>
       <w:r>
         <w:t>1.2 How it looks</w:t>
       </w:r>
@@ -5613,7 +5613,7 @@
           <w:noProof/>
         </w:rPr>
         <w:drawing>
-          <wp:inline distT="0" distB="0" distL="0" distR="0" wp14:anchorId="70B5C43E" wp14:editId="08366D15">
+          <wp:inline distT="0" distB="0" distL="0" distR="0" wp14:anchorId="0879CC63" wp14:editId="43A2AB6F">
             <wp:extent cx="5760000" cy="556494"/>
             <wp:effectExtent l="0" t="0" r="0" b="0"/>
             <wp:docPr id="1" name="Picture 1"/>
@@ -5668,7 +5668,7 @@
           <w:noProof/>
         </w:rPr>
         <w:drawing>
-          <wp:inline distT="0" distB="0" distL="0" distR="0" wp14:anchorId="2B0385BD" wp14:editId="412E6599">
+          <wp:inline distT="0" distB="0" distL="0" distR="0" wp14:anchorId="5297A760" wp14:editId="1EFCF6DA">
             <wp:extent cx="5760000" cy="1425657"/>
             <wp:effectExtent l="0" t="0" r="0" b="0"/>
             <wp:docPr id="2" name="Picture 2"/>
@@ -5723,7 +5723,7 @@
           <w:noProof/>
         </w:rPr>
         <w:drawing>
-          <wp:inline distT="0" distB="0" distL="0" distR="0" wp14:anchorId="2BFC726E" wp14:editId="0EBEA341">
+          <wp:inline distT="0" distB="0" distL="0" distR="0" wp14:anchorId="6996CF07" wp14:editId="59912478">
             <wp:extent cx="5760000" cy="1270757"/>
             <wp:effectExtent l="0" t="0" r="0" b="0"/>
             <wp:docPr id="3" name="Picture 3"/>
@@ -5772,7 +5772,7 @@
       <w:pPr>
         <w:pStyle w:val="Heading2"/>
       </w:pPr>
-      <w:bookmarkStart w:id="6" w:name="_Toc241869354"/>
+      <w:bookmarkStart w:id="6" w:name="_Toc241877252"/>
       <w:r>
         <w:t>1.3 Comparison with the PCF Gallery N:N control</w:t>
       </w:r>
@@ -6521,7 +6521,7 @@
       <w:pPr>
         <w:pStyle w:val="Heading1"/>
       </w:pPr>
-      <w:bookmarkStart w:id="7" w:name="_Toc241869355"/>
+      <w:bookmarkStart w:id="7" w:name="_Toc241877253"/>
       <w:r>
         <w:t>2. Package contents</w:t>
       </w:r>
@@ -6531,7 +6531,7 @@
       <w:pPr>
         <w:pStyle w:val="Heading2"/>
       </w:pPr>
-      <w:bookmarkStart w:id="8" w:name="_Toc241869356"/>
+      <w:bookmarkStart w:id="8" w:name="_Toc241877254"/>
       <w:r>
         <w:t>2.1 Files in the package</w:t>
       </w:r>
@@ -6891,7 +6891,7 @@
       <w:pPr>
         <w:pStyle w:val="Heading2"/>
       </w:pPr>
-      <w:bookmarkStart w:id="9" w:name="_Toc241869357"/>
+      <w:bookmarkStart w:id="9" w:name="_Toc241877255"/>
       <w:r>
         <w:t xml:space="preserve">2.2 </w:t>
       </w:r>
@@ -7285,7 +7285,7 @@
       <w:pPr>
         <w:pStyle w:val="Heading2"/>
       </w:pPr>
-      <w:bookmarkStart w:id="10" w:name="_Toc241869358"/>
+      <w:bookmarkStart w:id="10" w:name="_Toc241877256"/>
       <w:r>
         <w:t>2.3 Components in the solution</w:t>
       </w:r>
@@ -7507,7 +7507,7 @@
         </w:rPr>
         <w:lastRenderedPageBreak/>
         <w:drawing>
-          <wp:inline distT="0" distB="0" distL="0" distR="0" wp14:anchorId="4289BE6B" wp14:editId="395AE57D">
+          <wp:inline distT="0" distB="0" distL="0" distR="0" wp14:anchorId="30310322" wp14:editId="63520CA3">
             <wp:extent cx="5760000" cy="2062425"/>
             <wp:effectExtent l="0" t="0" r="0" b="0"/>
             <wp:docPr id="4" name="Picture 4"/>
@@ -7556,7 +7556,7 @@
       <w:pPr>
         <w:pStyle w:val="Heading2"/>
       </w:pPr>
-      <w:bookmarkStart w:id="11" w:name="_Toc241869359"/>
+      <w:bookmarkStart w:id="11" w:name="_Toc241877257"/>
       <w:r>
         <w:t>2.4 Source code</w:t>
       </w:r>
@@ -7564,10 +7564,10 @@
     </w:p>
     <w:p>
       <w:r>
-        <w:t xml:space="preserve">The source code is published as a Git repository, and the control is </w:t>
-      </w:r>
-      <w:r>
-        <w:t>free to use. Its layout:</w:t>
+        <w:t xml:space="preserve">The source code is published as a Git repository under the MIT </w:t>
+      </w:r>
+      <w:r>
+        <w:t>license: the control is free to use, modify and share, including commercially, provided the copyright notice and the license text are kept with copies of the code. Its layout:</w:t>
       </w:r>
     </w:p>
     <w:tbl>
@@ -7813,13 +7813,7 @@
               <w:rPr>
                 <w:sz w:val="19"/>
               </w:rPr>
-              <w:t xml:space="preserve">Dataverse solution project: </w:t>
-            </w:r>
-            <w:r>
-              <w:rPr>
-                <w:sz w:val="19"/>
-              </w:rPr>
-              <w:t>publisher, version, form library web resource</w:t>
+              <w:t>Dataverse solution project: publisher, version, form library web resource</w:t>
             </w:r>
           </w:p>
         </w:tc>
@@ -7860,7 +7854,13 @@
               <w:rPr>
                 <w:sz w:val="19"/>
               </w:rPr>
-              <w:t>Release build: bundle, both solution packages, checks</w:t>
+              <w:t xml:space="preserve">Release build: </w:t>
+            </w:r>
+            <w:r>
+              <w:rPr>
+                <w:sz w:val="19"/>
+              </w:rPr>
+              <w:t>bundle, both solution packages, checks</w:t>
             </w:r>
           </w:p>
         </w:tc>
@@ -8052,7 +8052,7 @@
       <w:pPr>
         <w:pStyle w:val="Heading1"/>
       </w:pPr>
-      <w:bookmarkStart w:id="12" w:name="_Toc241869360"/>
+      <w:bookmarkStart w:id="12" w:name="_Toc241877258"/>
       <w:r>
         <w:lastRenderedPageBreak/>
         <w:t>3. Installation</w:t>
@@ -8063,7 +8063,7 @@
       <w:pPr>
         <w:pStyle w:val="Heading2"/>
       </w:pPr>
-      <w:bookmarkStart w:id="13" w:name="_Toc241869361"/>
+      <w:bookmarkStart w:id="13" w:name="_Toc241877259"/>
       <w:r>
         <w:t>3.1 Before you start</w:t>
       </w:r>
@@ -8097,7 +8097,7 @@
       <w:pPr>
         <w:pStyle w:val="Heading2"/>
       </w:pPr>
-      <w:bookmarkStart w:id="14" w:name="_Toc241869362"/>
+      <w:bookmarkStart w:id="14" w:name="_Toc241877260"/>
       <w:r>
         <w:t>3.2 Import the unmanaged solution (development)</w:t>
       </w:r>
@@ -8143,7 +8143,7 @@
           <w:noProof/>
         </w:rPr>
         <w:drawing>
-          <wp:inline distT="0" distB="0" distL="0" distR="0" wp14:anchorId="6F22C559" wp14:editId="23F9D87A">
+          <wp:inline distT="0" distB="0" distL="0" distR="0" wp14:anchorId="5DBBA886" wp14:editId="033CF852">
             <wp:extent cx="5760000" cy="2809936"/>
             <wp:effectExtent l="0" t="0" r="0" b="0"/>
             <wp:docPr id="5" name="Picture 5"/>
@@ -8228,7 +8228,7 @@
           <w:noProof/>
         </w:rPr>
         <w:drawing>
-          <wp:inline distT="0" distB="0" distL="0" distR="0" wp14:anchorId="42F27E96" wp14:editId="6BEF1828">
+          <wp:inline distT="0" distB="0" distL="0" distR="0" wp14:anchorId="550F1AE2" wp14:editId="3F8739AE">
             <wp:extent cx="5760000" cy="1964781"/>
             <wp:effectExtent l="0" t="0" r="0" b="0"/>
             <wp:docPr id="6" name="Picture 6"/>
@@ -8270,7 +8270,10 @@
         <w:jc w:val="center"/>
       </w:pPr>
       <w:r>
-        <w:t>Figure 6. Browse for the solution file.</w:t>
+        <w:t xml:space="preserve">Figure 6. </w:t>
+      </w:r>
+      <w:r>
+        <w:t>Browse for the solution file.</w:t>
       </w:r>
     </w:p>
     <w:p>
@@ -8316,7 +8319,7 @@
         </w:rPr>
         <w:lastRenderedPageBreak/>
         <w:drawing>
-          <wp:inline distT="0" distB="0" distL="0" distR="0" wp14:anchorId="4E7EA44D" wp14:editId="6B71FBDB">
+          <wp:inline distT="0" distB="0" distL="0" distR="0" wp14:anchorId="41BC9011" wp14:editId="79EFBD6E">
             <wp:extent cx="5760000" cy="1964781"/>
             <wp:effectExtent l="0" t="0" r="0" b="0"/>
             <wp:docPr id="7" name="Picture 7"/>
@@ -8421,7 +8424,7 @@
           <w:noProof/>
         </w:rPr>
         <w:drawing>
-          <wp:inline distT="0" distB="0" distL="0" distR="0" wp14:anchorId="0ED7F141" wp14:editId="0D4F0549">
+          <wp:inline distT="0" distB="0" distL="0" distR="0" wp14:anchorId="7D431C51" wp14:editId="12A25D45">
             <wp:extent cx="5470632" cy="3779999"/>
             <wp:effectExtent l="0" t="0" r="0" b="0"/>
             <wp:docPr id="8" name="Picture 8"/>
@@ -8489,7 +8492,7 @@
         </w:rPr>
         <w:lastRenderedPageBreak/>
         <w:drawing>
-          <wp:inline distT="0" distB="0" distL="0" distR="0" wp14:anchorId="2B8A7D9D" wp14:editId="7B01BD6F">
+          <wp:inline distT="0" distB="0" distL="0" distR="0" wp14:anchorId="79E0CDB2" wp14:editId="40401741">
             <wp:extent cx="5760000" cy="2072420"/>
             <wp:effectExtent l="0" t="0" r="0" b="0"/>
             <wp:docPr id="9" name="Picture 9"/>
@@ -8543,7 +8546,10 @@
         </w:numPr>
       </w:pPr>
       <w:r>
-        <w:t>When the import has finished, a banner confirms it.</w:t>
+        <w:t xml:space="preserve">When the import has finished, a </w:t>
+      </w:r>
+      <w:r>
+        <w:t>banner confirms it.</w:t>
       </w:r>
     </w:p>
     <w:p>
@@ -8556,7 +8562,7 @@
           <w:noProof/>
         </w:rPr>
         <w:drawing>
-          <wp:inline distT="0" distB="0" distL="0" distR="0" wp14:anchorId="0CCD3D85" wp14:editId="38BDC3E6">
+          <wp:inline distT="0" distB="0" distL="0" distR="0" wp14:anchorId="75C90089" wp14:editId="3B268580">
             <wp:extent cx="5760000" cy="2072420"/>
             <wp:effectExtent l="0" t="0" r="0" b="0"/>
             <wp:docPr id="10" name="Picture 10"/>
@@ -8598,10 +8604,7 @@
         <w:jc w:val="center"/>
       </w:pPr>
       <w:r>
-        <w:t xml:space="preserve">Figure 10. Import </w:t>
-      </w:r>
-      <w:r>
-        <w:t>finished.</w:t>
+        <w:t>Figure 10. Import finished.</w:t>
       </w:r>
     </w:p>
     <w:p>
@@ -8635,7 +8638,7 @@
           <w:noProof/>
         </w:rPr>
         <w:drawing>
-          <wp:inline distT="0" distB="0" distL="0" distR="0" wp14:anchorId="63112B50" wp14:editId="24B79752">
+          <wp:inline distT="0" distB="0" distL="0" distR="0" wp14:anchorId="4FDC518C" wp14:editId="52313DBA">
             <wp:extent cx="5760000" cy="2072420"/>
             <wp:effectExtent l="0" t="0" r="0" b="0"/>
             <wp:docPr id="11" name="Picture 11"/>
@@ -8721,7 +8724,7 @@
         </w:rPr>
         <w:lastRenderedPageBreak/>
         <w:drawing>
-          <wp:inline distT="0" distB="0" distL="0" distR="0" wp14:anchorId="3234F6E9" wp14:editId="34F1257B">
+          <wp:inline distT="0" distB="0" distL="0" distR="0" wp14:anchorId="4619E88E" wp14:editId="6AFB5D36">
             <wp:extent cx="5760000" cy="1700511"/>
             <wp:effectExtent l="0" t="0" r="0" b="0"/>
             <wp:docPr id="12" name="Picture 12"/>
@@ -8808,7 +8811,7 @@
       <w:pPr>
         <w:pStyle w:val="Heading2"/>
       </w:pPr>
-      <w:bookmarkStart w:id="15" w:name="_Toc241869363"/>
+      <w:bookmarkStart w:id="15" w:name="_Toc241877261"/>
       <w:r>
         <w:t>3.3 Import the managed solution (test and production)</w:t>
       </w:r>
@@ -8900,7 +8903,7 @@
           <w:noProof/>
         </w:rPr>
         <w:drawing>
-          <wp:inline distT="0" distB="0" distL="0" distR="0" wp14:anchorId="2237BB8C" wp14:editId="4F22B7DC">
+          <wp:inline distT="0" distB="0" distL="0" distR="0" wp14:anchorId="4833C159" wp14:editId="048D605B">
             <wp:extent cx="5760000" cy="1964781"/>
             <wp:effectExtent l="0" t="0" r="0" b="0"/>
             <wp:docPr id="13" name="Picture 13"/>
@@ -8995,7 +8998,7 @@
         </w:rPr>
         <w:lastRenderedPageBreak/>
         <w:drawing>
-          <wp:inline distT="0" distB="0" distL="0" distR="0" wp14:anchorId="01F45023" wp14:editId="14B300B2">
+          <wp:inline distT="0" distB="0" distL="0" distR="0" wp14:anchorId="3EB6418D" wp14:editId="70FD846E">
             <wp:extent cx="5470632" cy="3779999"/>
             <wp:effectExtent l="0" t="0" r="0" b="0"/>
             <wp:docPr id="14" name="Picture 14"/>
@@ -9037,7 +9040,10 @@
         <w:jc w:val="center"/>
       </w:pPr>
       <w:r>
-        <w:t>Figure 14. Solution details of the managed package.</w:t>
+        <w:t xml:space="preserve">Figure 14. Solution details of the </w:t>
+      </w:r>
+      <w:r>
+        <w:t>managed package.</w:t>
       </w:r>
     </w:p>
     <w:p>
@@ -9049,10 +9055,7 @@
         </w:numPr>
       </w:pPr>
       <w:r>
-        <w:t xml:space="preserve">Wait for the </w:t>
-      </w:r>
-      <w:r>
-        <w:t>confirmation. A managed import does not need Publish all customizations; the components are live when the import finishes.</w:t>
+        <w:t>Wait for the confirmation. A managed import does not need Publish all customizations; the components are live when the import finishes.</w:t>
       </w:r>
     </w:p>
     <w:p>
@@ -9065,7 +9068,7 @@
           <w:noProof/>
         </w:rPr>
         <w:drawing>
-          <wp:inline distT="0" distB="0" distL="0" distR="0" wp14:anchorId="322E6610" wp14:editId="390E4389">
+          <wp:inline distT="0" distB="0" distL="0" distR="0" wp14:anchorId="48CE515E" wp14:editId="2E146216">
             <wp:extent cx="5760000" cy="2072420"/>
             <wp:effectExtent l="0" t="0" r="0" b="0"/>
             <wp:docPr id="15" name="Picture 15"/>
@@ -9114,7 +9117,7 @@
       <w:pPr>
         <w:pStyle w:val="Heading2"/>
       </w:pPr>
-      <w:bookmarkStart w:id="16" w:name="_Toc241869364"/>
+      <w:bookmarkStart w:id="16" w:name="_Toc241877262"/>
       <w:r>
         <w:t>3.4 Check the installation</w:t>
       </w:r>
@@ -9145,7 +9148,7 @@
         </w:rPr>
         <w:lastRenderedPageBreak/>
         <w:drawing>
-          <wp:inline distT="0" distB="0" distL="0" distR="0" wp14:anchorId="7341C2CC" wp14:editId="3CDAF8C2">
+          <wp:inline distT="0" distB="0" distL="0" distR="0" wp14:anchorId="5F039EC9" wp14:editId="28EF7916">
             <wp:extent cx="5760000" cy="2247805"/>
             <wp:effectExtent l="0" t="0" r="0" b="0"/>
             <wp:docPr id="16" name="Picture 16"/>
@@ -9194,7 +9197,7 @@
       <w:pPr>
         <w:pStyle w:val="Heading1"/>
       </w:pPr>
-      <w:bookmarkStart w:id="17" w:name="_Toc241869365"/>
+      <w:bookmarkStart w:id="17" w:name="_Toc241877263"/>
       <w:r>
         <w:t>4. Adding the control to a form</w:t>
       </w:r>
@@ -9204,7 +9207,7 @@
       <w:pPr>
         <w:pStyle w:val="Heading2"/>
       </w:pPr>
-      <w:bookmarkStart w:id="18" w:name="_Toc241869366"/>
+      <w:bookmarkStart w:id="18" w:name="_Toc241877264"/>
       <w:r>
         <w:t>4.1 Prepare</w:t>
       </w:r>
@@ -9507,7 +9510,7 @@
       <w:pPr>
         <w:pStyle w:val="Heading2"/>
       </w:pPr>
-      <w:bookmarkStart w:id="19" w:name="_Toc241869367"/>
+      <w:bookmarkStart w:id="19" w:name="_Toc241877265"/>
       <w:r>
         <w:t>4.2 Add the control in the form designer</w:t>
       </w:r>
@@ -9536,7 +9539,7 @@
         </w:rPr>
         <w:lastRenderedPageBreak/>
         <w:drawing>
-          <wp:inline distT="0" distB="0" distL="0" distR="0" wp14:anchorId="3785ECA4" wp14:editId="27D411F7">
+          <wp:inline distT="0" distB="0" distL="0" distR="0" wp14:anchorId="06050255" wp14:editId="09373958">
             <wp:extent cx="5760000" cy="3601998"/>
             <wp:effectExtent l="0" t="0" r="0" b="0"/>
             <wp:docPr id="17" name="Picture 17"/>
@@ -9621,7 +9624,7 @@
           <w:noProof/>
         </w:rPr>
         <w:drawing>
-          <wp:inline distT="0" distB="0" distL="0" distR="0" wp14:anchorId="0DC20806" wp14:editId="67BA991B">
+          <wp:inline distT="0" distB="0" distL="0" distR="0" wp14:anchorId="269F9CDE" wp14:editId="5451B774">
             <wp:extent cx="1351671" cy="3779997"/>
             <wp:effectExtent l="0" t="0" r="0" b="0"/>
             <wp:docPr id="18" name="Picture 18"/>
@@ -9716,7 +9719,7 @@
           <w:noProof/>
         </w:rPr>
         <w:drawing>
-          <wp:inline distT="0" distB="0" distL="0" distR="0" wp14:anchorId="7C909339" wp14:editId="516CD98F">
+          <wp:inline distT="0" distB="0" distL="0" distR="0" wp14:anchorId="5DF7CFEE" wp14:editId="06F0C1CB">
             <wp:extent cx="1695000" cy="2520000"/>
             <wp:effectExtent l="0" t="0" r="0" b="0"/>
             <wp:docPr id="19" name="Picture 19"/>
@@ -9801,7 +9804,7 @@
           <w:noProof/>
         </w:rPr>
         <w:drawing>
-          <wp:inline distT="0" distB="0" distL="0" distR="0" wp14:anchorId="57E3137F" wp14:editId="3D6FD317">
+          <wp:inline distT="0" distB="0" distL="0" distR="0" wp14:anchorId="5D47448A" wp14:editId="121D3A07">
             <wp:extent cx="5760000" cy="3637403"/>
             <wp:effectExtent l="0" t="0" r="0" b="0"/>
             <wp:docPr id="20" name="Picture 20"/>
@@ -9914,7 +9917,7 @@
         </w:rPr>
         <w:lastRenderedPageBreak/>
         <w:drawing>
-          <wp:inline distT="0" distB="0" distL="0" distR="0" wp14:anchorId="0601FF09" wp14:editId="15A1C268">
+          <wp:inline distT="0" distB="0" distL="0" distR="0" wp14:anchorId="0647D47F" wp14:editId="0CAFB739">
             <wp:extent cx="1328434" cy="3599999"/>
             <wp:effectExtent l="0" t="0" r="0" b="0"/>
             <wp:docPr id="21" name="Picture 21"/>
@@ -9981,7 +9984,7 @@
           <w:noProof/>
         </w:rPr>
         <w:drawing>
-          <wp:inline distT="0" distB="0" distL="0" distR="0" wp14:anchorId="79ABC3DA" wp14:editId="4D858B9D">
+          <wp:inline distT="0" distB="0" distL="0" distR="0" wp14:anchorId="4C14CA31" wp14:editId="549D9463">
             <wp:extent cx="3240000" cy="2047792"/>
             <wp:effectExtent l="0" t="0" r="0" b="0"/>
             <wp:docPr id="22" name="Picture 22"/>
@@ -10058,7 +10061,7 @@
         </w:rPr>
         <w:lastRenderedPageBreak/>
         <w:drawing>
-          <wp:inline distT="0" distB="0" distL="0" distR="0" wp14:anchorId="1749E4F9" wp14:editId="08E1DD42">
+          <wp:inline distT="0" distB="0" distL="0" distR="0" wp14:anchorId="3C528AF5" wp14:editId="45A9AF8C">
             <wp:extent cx="5760000" cy="1617077"/>
             <wp:effectExtent l="0" t="0" r="0" b="0"/>
             <wp:docPr id="23" name="Picture 23"/>
@@ -10119,7 +10122,7 @@
       <w:pPr>
         <w:pStyle w:val="Heading2"/>
       </w:pPr>
-      <w:bookmarkStart w:id="20" w:name="_Toc241869368"/>
+      <w:bookmarkStart w:id="20" w:name="_Toc241877266"/>
       <w:r>
         <w:t xml:space="preserve">4.3 </w:t>
       </w:r>
@@ -10556,7 +10559,7 @@
       <w:pPr>
         <w:pStyle w:val="Heading1"/>
       </w:pPr>
-      <w:bookmarkStart w:id="21" w:name="_Toc241869369"/>
+      <w:bookmarkStart w:id="21" w:name="_Toc241877267"/>
       <w:r>
         <w:t xml:space="preserve">5. Settings </w:t>
       </w:r>
@@ -10600,7 +10603,7 @@
               </w:rPr>
               <w:lastRenderedPageBreak/>
               <w:drawing>
-                <wp:inline distT="0" distB="0" distL="0" distR="0" wp14:anchorId="5BF1D450" wp14:editId="676AE8C3">
+                <wp:inline distT="0" distB="0" distL="0" distR="0" wp14:anchorId="19C05FD5" wp14:editId="04293D48">
                   <wp:extent cx="1899710" cy="5220000"/>
                   <wp:effectExtent l="0" t="0" r="0" b="0"/>
                   <wp:docPr id="24" name="Picture 24"/>
@@ -10650,7 +10653,7 @@
                 <w:noProof/>
               </w:rPr>
               <w:drawing>
-                <wp:inline distT="0" distB="0" distL="0" distR="0" wp14:anchorId="0B7069AB" wp14:editId="72927D04">
+                <wp:inline distT="0" distB="0" distL="0" distR="0" wp14:anchorId="3D20B0E6" wp14:editId="2A2F34CF">
                   <wp:extent cx="1915129" cy="5219998"/>
                   <wp:effectExtent l="0" t="0" r="0" b="0"/>
                   <wp:docPr id="25" name="Picture 25"/>
@@ -10700,7 +10703,7 @@
                 <w:noProof/>
               </w:rPr>
               <w:drawing>
-                <wp:inline distT="0" distB="0" distL="0" distR="0" wp14:anchorId="78D2EF9F" wp14:editId="4F3F99A0">
+                <wp:inline distT="0" distB="0" distL="0" distR="0" wp14:anchorId="7009A716" wp14:editId="3D5BF88B">
                   <wp:extent cx="1916685" cy="5219998"/>
                   <wp:effectExtent l="0" t="0" r="0" b="0"/>
                   <wp:docPr id="26" name="Picture 26"/>
@@ -10755,7 +10758,7 @@
       <w:pPr>
         <w:pStyle w:val="Heading2"/>
       </w:pPr>
-      <w:bookmarkStart w:id="22" w:name="_Toc241869370"/>
+      <w:bookmarkStart w:id="22" w:name="_Toc241877268"/>
       <w:r>
         <w:t>5.1 Static value and Bind to table column</w:t>
       </w:r>
@@ -10788,7 +10791,7 @@
       <w:pPr>
         <w:pStyle w:val="Heading2"/>
       </w:pPr>
-      <w:bookmarkStart w:id="23" w:name="_Toc241869371"/>
+      <w:bookmarkStart w:id="23" w:name="_Toc241877269"/>
       <w:r>
         <w:t>5.2 All settings</w:t>
       </w:r>
@@ -11963,7 +11966,7 @@
       <w:pPr>
         <w:pStyle w:val="Heading2"/>
       </w:pPr>
-      <w:bookmarkStart w:id="24" w:name="_Toc241869372"/>
+      <w:bookmarkStart w:id="24" w:name="_Toc241877270"/>
       <w:r>
         <w:t>5.3 Which records can be selected</w:t>
       </w:r>
@@ -12122,7 +12125,7 @@
       <w:pPr>
         <w:pStyle w:val="Heading2"/>
       </w:pPr>
-      <w:bookmarkStart w:id="25" w:name="_Toc241869373"/>
+      <w:bookmarkStart w:id="25" w:name="_Toc241877271"/>
       <w:r>
         <w:t>5.4 Views in multilingual environments</w:t>
       </w:r>
@@ -12171,7 +12174,7 @@
       <w:pPr>
         <w:pStyle w:val="Heading2"/>
       </w:pPr>
-      <w:bookmarkStart w:id="26" w:name="_Toc241869374"/>
+      <w:bookmarkStart w:id="26" w:name="_Toc241877272"/>
       <w:r>
         <w:t>5.5 Subgrids</w:t>
       </w:r>
@@ -12200,7 +12203,7 @@
       <w:pPr>
         <w:pStyle w:val="Heading2"/>
       </w:pPr>
-      <w:bookmarkStart w:id="27" w:name="_Toc241869375"/>
+      <w:bookmarkStart w:id="27" w:name="_Toc241877273"/>
       <w:r>
         <w:t>5.6 Copy names into the host column</w:t>
       </w:r>
@@ -12222,7 +12225,7 @@
         </w:rPr>
         <w:lastRenderedPageBreak/>
         <w:drawing>
-          <wp:inline distT="0" distB="0" distL="0" distR="0" wp14:anchorId="55F57A7F" wp14:editId="45693F24">
+          <wp:inline distT="0" distB="0" distL="0" distR="0" wp14:anchorId="0C5AC896" wp14:editId="11CDDF0A">
             <wp:extent cx="5760000" cy="1212632"/>
             <wp:effectExtent l="0" t="0" r="0" b="0"/>
             <wp:docPr id="27" name="Picture 27"/>
@@ -12303,7 +12306,7 @@
       <w:pPr>
         <w:pStyle w:val="Heading2"/>
       </w:pPr>
-      <w:bookmarkStart w:id="28" w:name="_Toc241869376"/>
+      <w:bookmarkStart w:id="28" w:name="_Toc241877274"/>
       <w:r>
         <w:t>5.7 Open selected records</w:t>
       </w:r>
@@ -12324,7 +12327,7 @@
           <w:noProof/>
         </w:rPr>
         <w:drawing>
-          <wp:inline distT="0" distB="0" distL="0" distR="0" wp14:anchorId="71A81C38" wp14:editId="594F8FDF">
+          <wp:inline distT="0" distB="0" distL="0" distR="0" wp14:anchorId="21F22D1F" wp14:editId="62B9B15C">
             <wp:extent cx="5760000" cy="556494"/>
             <wp:effectExtent l="0" t="0" r="0" b="0"/>
             <wp:docPr id="28" name="Picture 28"/>
@@ -12373,7 +12376,7 @@
       <w:pPr>
         <w:pStyle w:val="Heading2"/>
       </w:pPr>
-      <w:bookmarkStart w:id="29" w:name="_Toc241869377"/>
+      <w:bookmarkStart w:id="29" w:name="_Toc241877275"/>
       <w:r>
         <w:t>5.8 Show + New button</w:t>
       </w:r>
@@ -12467,7 +12470,7 @@
         </w:rPr>
         <w:lastRenderedPageBreak/>
         <w:drawing>
-          <wp:inline distT="0" distB="0" distL="0" distR="0" wp14:anchorId="5C4F3DD8" wp14:editId="67046D85">
+          <wp:inline distT="0" distB="0" distL="0" distR="0" wp14:anchorId="08D611FB" wp14:editId="177C91D1">
             <wp:extent cx="5760000" cy="1121594"/>
             <wp:effectExtent l="0" t="0" r="0" b="0"/>
             <wp:docPr id="29" name="Picture 29"/>
@@ -12543,7 +12546,7 @@
           <w:noProof/>
         </w:rPr>
         <w:drawing>
-          <wp:inline distT="0" distB="0" distL="0" distR="0" wp14:anchorId="2FEA704B" wp14:editId="4FE2B314">
+          <wp:inline distT="0" distB="0" distL="0" distR="0" wp14:anchorId="20F2CB48" wp14:editId="1D6D4028">
             <wp:extent cx="5760000" cy="2964269"/>
             <wp:effectExtent l="0" t="0" r="0" b="0"/>
             <wp:docPr id="30" name="Picture 30"/>
@@ -12610,7 +12613,7 @@
           <w:noProof/>
         </w:rPr>
         <w:drawing>
-          <wp:inline distT="0" distB="0" distL="0" distR="0" wp14:anchorId="46FCEB32" wp14:editId="6FD7AA56">
+          <wp:inline distT="0" distB="0" distL="0" distR="0" wp14:anchorId="0342FE73" wp14:editId="3C2832EE">
             <wp:extent cx="5760000" cy="668367"/>
             <wp:effectExtent l="0" t="0" r="0" b="0"/>
             <wp:docPr id="31" name="Picture 31"/>
@@ -12664,7 +12667,7 @@
       <w:pPr>
         <w:pStyle w:val="Heading1"/>
       </w:pPr>
-      <w:bookmarkStart w:id="30" w:name="_Toc241869378"/>
+      <w:bookmarkStart w:id="30" w:name="_Toc241877276"/>
       <w:r>
         <w:t>6. Using the control</w:t>
       </w:r>
@@ -12674,7 +12677,7 @@
       <w:pPr>
         <w:pStyle w:val="Heading2"/>
       </w:pPr>
-      <w:bookmarkStart w:id="31" w:name="_Toc241869379"/>
+      <w:bookmarkStart w:id="31" w:name="_Toc241877277"/>
       <w:r>
         <w:t>6.1 States of the field</w:t>
       </w:r>
@@ -12948,7 +12951,7 @@
           <w:noProof/>
         </w:rPr>
         <w:drawing>
-          <wp:inline distT="0" distB="0" distL="0" distR="0" wp14:anchorId="3FAEA8E4" wp14:editId="2A921237">
+          <wp:inline distT="0" distB="0" distL="0" distR="0" wp14:anchorId="6D36B44B" wp14:editId="66AF9E4D">
             <wp:extent cx="5760000" cy="1276494"/>
             <wp:effectExtent l="0" t="0" r="0" b="0"/>
             <wp:docPr id="32" name="Picture 32"/>
@@ -13003,7 +13006,7 @@
           <w:noProof/>
         </w:rPr>
         <w:drawing>
-          <wp:inline distT="0" distB="0" distL="0" distR="0" wp14:anchorId="40D18439" wp14:editId="40CA5A0B">
+          <wp:inline distT="0" distB="0" distL="0" distR="0" wp14:anchorId="7A58CFF4" wp14:editId="3C2EB7A1">
             <wp:extent cx="5760000" cy="823267"/>
             <wp:effectExtent l="0" t="0" r="0" b="0"/>
             <wp:docPr id="33" name="Picture 33"/>
@@ -13061,7 +13064,7 @@
           <w:noProof/>
         </w:rPr>
         <w:drawing>
-          <wp:inline distT="0" distB="0" distL="0" distR="0" wp14:anchorId="2DED41F2" wp14:editId="0207B49D">
+          <wp:inline distT="0" distB="0" distL="0" distR="0" wp14:anchorId="67477C38" wp14:editId="3C755D4A">
             <wp:extent cx="5760000" cy="565100"/>
             <wp:effectExtent l="0" t="0" r="0" b="0"/>
             <wp:docPr id="34" name="Picture 34"/>
@@ -13110,7 +13113,7 @@
       <w:pPr>
         <w:pStyle w:val="Heading2"/>
       </w:pPr>
-      <w:bookmarkStart w:id="32" w:name="_Toc241869380"/>
+      <w:bookmarkStart w:id="32" w:name="_Toc241877278"/>
       <w:r>
         <w:t>6.2 Selecting and removing records</w:t>
       </w:r>
@@ -13132,7 +13135,7 @@
         </w:rPr>
         <w:lastRenderedPageBreak/>
         <w:drawing>
-          <wp:inline distT="0" distB="0" distL="0" distR="0" wp14:anchorId="7CA89A63" wp14:editId="6B37C060">
+          <wp:inline distT="0" distB="0" distL="0" distR="0" wp14:anchorId="7D88BDC4" wp14:editId="01E4F8E6">
             <wp:extent cx="5760000" cy="2821224"/>
             <wp:effectExtent l="0" t="0" r="0" b="0"/>
             <wp:docPr id="35" name="Picture 35"/>
@@ -13181,7 +13184,7 @@
       <w:pPr>
         <w:pStyle w:val="Heading2"/>
       </w:pPr>
-      <w:bookmarkStart w:id="33" w:name="_Toc241869381"/>
+      <w:bookmarkStart w:id="33" w:name="_Toc241877279"/>
       <w:r>
         <w:t>6.3 New records</w:t>
       </w:r>
@@ -13205,7 +13208,7 @@
           <w:noProof/>
         </w:rPr>
         <w:drawing>
-          <wp:inline distT="0" distB="0" distL="0" distR="0" wp14:anchorId="54DC0FBF" wp14:editId="1954E962">
+          <wp:inline distT="0" distB="0" distL="0" distR="0" wp14:anchorId="482D4A39" wp14:editId="0C854F2B">
             <wp:extent cx="5760000" cy="668367"/>
             <wp:effectExtent l="0" t="0" r="0" b="0"/>
             <wp:docPr id="36" name="Picture 36"/>
@@ -13254,7 +13257,7 @@
       <w:pPr>
         <w:pStyle w:val="Heading2"/>
       </w:pPr>
-      <w:bookmarkStart w:id="34" w:name="_Toc241869382"/>
+      <w:bookmarkStart w:id="34" w:name="_Toc241877280"/>
       <w:r>
         <w:t>6.4 Many values</w:t>
       </w:r>
@@ -13275,7 +13278,7 @@
           <w:noProof/>
         </w:rPr>
         <w:drawing>
-          <wp:inline distT="0" distB="0" distL="0" distR="0" wp14:anchorId="698A03A8" wp14:editId="6EBB2091">
+          <wp:inline distT="0" distB="0" distL="0" distR="0" wp14:anchorId="713AE2A9" wp14:editId="7B165684">
             <wp:extent cx="5760000" cy="513466"/>
             <wp:effectExtent l="0" t="0" r="0" b="0"/>
             <wp:docPr id="37" name="Picture 37"/>
@@ -13331,7 +13334,7 @@
         </w:rPr>
         <w:lastRenderedPageBreak/>
         <w:drawing>
-          <wp:inline distT="0" distB="0" distL="0" distR="0" wp14:anchorId="1BDD4108" wp14:editId="1214882E">
+          <wp:inline distT="0" distB="0" distL="0" distR="0" wp14:anchorId="2302002A" wp14:editId="1ECD08A0">
             <wp:extent cx="5760000" cy="866295"/>
             <wp:effectExtent l="0" t="0" r="0" b="0"/>
             <wp:docPr id="38" name="Picture 38"/>
@@ -13380,7 +13383,7 @@
       <w:pPr>
         <w:pStyle w:val="Heading2"/>
       </w:pPr>
-      <w:bookmarkStart w:id="35" w:name="_Toc241869383"/>
+      <w:bookmarkStart w:id="35" w:name="_Toc241877281"/>
       <w:r>
         <w:t>6.5 Large lists</w:t>
       </w:r>
@@ -13461,7 +13464,7 @@
           <w:noProof/>
         </w:rPr>
         <w:drawing>
-          <wp:inline distT="0" distB="0" distL="0" distR="0" wp14:anchorId="38B90FFF" wp14:editId="2EA787D3">
+          <wp:inline distT="0" distB="0" distL="0" distR="0" wp14:anchorId="3AD0B2E6" wp14:editId="736BF40C">
             <wp:extent cx="5760000" cy="1121594"/>
             <wp:effectExtent l="0" t="0" r="0" b="0"/>
             <wp:docPr id="39" name="Picture 39"/>
@@ -13516,7 +13519,7 @@
           <w:noProof/>
         </w:rPr>
         <w:drawing>
-          <wp:inline distT="0" distB="0" distL="0" distR="0" wp14:anchorId="6C12697D" wp14:editId="1965D753">
+          <wp:inline distT="0" distB="0" distL="0" distR="0" wp14:anchorId="0F7E700A" wp14:editId="009CF6E5">
             <wp:extent cx="5760000" cy="1121594"/>
             <wp:effectExtent l="0" t="0" r="0" b="0"/>
             <wp:docPr id="40" name="Picture 40"/>
@@ -13571,7 +13574,7 @@
           <w:noProof/>
         </w:rPr>
         <w:drawing>
-          <wp:inline distT="0" distB="0" distL="0" distR="0" wp14:anchorId="730248D1" wp14:editId="39B06693">
+          <wp:inline distT="0" distB="0" distL="0" distR="0" wp14:anchorId="20B858B4" wp14:editId="5B2FBCFE">
             <wp:extent cx="5760000" cy="1121594"/>
             <wp:effectExtent l="0" t="0" r="0" b="0"/>
             <wp:docPr id="41" name="Picture 41"/>
@@ -13627,7 +13630,7 @@
         </w:rPr>
         <w:lastRenderedPageBreak/>
         <w:drawing>
-          <wp:inline distT="0" distB="0" distL="0" distR="0" wp14:anchorId="3F5BD790" wp14:editId="41699810">
+          <wp:inline distT="0" distB="0" distL="0" distR="0" wp14:anchorId="51724C2E" wp14:editId="28E15216">
             <wp:extent cx="5760000" cy="1121594"/>
             <wp:effectExtent l="0" t="0" r="0" b="0"/>
             <wp:docPr id="42" name="Picture 42"/>
@@ -13676,7 +13679,7 @@
       <w:pPr>
         <w:pStyle w:val="Heading2"/>
       </w:pPr>
-      <w:bookmarkStart w:id="36" w:name="_Toc241869384"/>
+      <w:bookmarkStart w:id="36" w:name="_Toc241877282"/>
       <w:r>
         <w:t xml:space="preserve">6.6 Select all and </w:t>
       </w:r>
@@ -13700,7 +13703,7 @@
           <w:noProof/>
         </w:rPr>
         <w:drawing>
-          <wp:inline distT="0" distB="0" distL="0" distR="0" wp14:anchorId="0AFB751C" wp14:editId="6BC857BC">
+          <wp:inline distT="0" distB="0" distL="0" distR="0" wp14:anchorId="6716D382" wp14:editId="71BD00EF">
             <wp:extent cx="5760000" cy="1614780"/>
             <wp:effectExtent l="0" t="0" r="0" b="0"/>
             <wp:docPr id="43" name="Picture 43"/>
@@ -13749,7 +13752,7 @@
       <w:pPr>
         <w:pStyle w:val="Heading2"/>
       </w:pPr>
-      <w:bookmarkStart w:id="37" w:name="_Toc241869385"/>
+      <w:bookmarkStart w:id="37" w:name="_Toc241877283"/>
       <w:r>
         <w:t>6.7 Keyboard</w:t>
       </w:r>
@@ -14208,7 +14211,7 @@
       <w:pPr>
         <w:pStyle w:val="Heading2"/>
       </w:pPr>
-      <w:bookmarkStart w:id="38" w:name="_Toc241869386"/>
+      <w:bookmarkStart w:id="38" w:name="_Toc241877284"/>
       <w:r>
         <w:t>6.8 Touch</w:t>
       </w:r>
@@ -14226,7 +14229,7 @@
       <w:pPr>
         <w:pStyle w:val="Heading2"/>
       </w:pPr>
-      <w:bookmarkStart w:id="39" w:name="_Toc241869387"/>
+      <w:bookmarkStart w:id="39" w:name="_Toc241877285"/>
       <w:r>
         <w:lastRenderedPageBreak/>
         <w:t>6.9 Messages</w:t>
@@ -14262,7 +14265,7 @@
           <w:noProof/>
         </w:rPr>
         <w:drawing>
-          <wp:inline distT="0" distB="0" distL="0" distR="0" wp14:anchorId="7FDAB9B5" wp14:editId="0513630C">
+          <wp:inline distT="0" distB="0" distL="0" distR="0" wp14:anchorId="7AD9C170" wp14:editId="0EDEE631">
             <wp:extent cx="5760000" cy="668367"/>
             <wp:effectExtent l="0" t="0" r="0" b="0"/>
             <wp:docPr id="44" name="Picture 44"/>
@@ -14317,7 +14320,7 @@
           <w:noProof/>
         </w:rPr>
         <w:drawing>
-          <wp:inline distT="0" distB="0" distL="0" distR="0" wp14:anchorId="53CB7470" wp14:editId="3F3EC58E">
+          <wp:inline distT="0" distB="0" distL="0" distR="0" wp14:anchorId="1831AD0F" wp14:editId="44C8E853">
             <wp:extent cx="5760000" cy="1219124"/>
             <wp:effectExtent l="0" t="0" r="0" b="0"/>
             <wp:docPr id="45" name="Picture 45"/>
@@ -14372,7 +14375,7 @@
           <w:noProof/>
         </w:rPr>
         <w:drawing>
-          <wp:inline distT="0" distB="0" distL="0" distR="0" wp14:anchorId="662D9C65" wp14:editId="7ED5B74A">
+          <wp:inline distT="0" distB="0" distL="0" distR="0" wp14:anchorId="6A8583C1" wp14:editId="1F1C6785">
             <wp:extent cx="5760000" cy="728606"/>
             <wp:effectExtent l="0" t="0" r="0" b="0"/>
             <wp:docPr id="46" name="Picture 46"/>
@@ -14427,7 +14430,7 @@
           <w:noProof/>
         </w:rPr>
         <w:drawing>
-          <wp:inline distT="0" distB="0" distL="0" distR="0" wp14:anchorId="67E58199" wp14:editId="6AA9C430">
+          <wp:inline distT="0" distB="0" distL="0" distR="0" wp14:anchorId="1FBC1C14" wp14:editId="0E8DFF0A">
             <wp:extent cx="5760000" cy="728606"/>
             <wp:effectExtent l="0" t="0" r="0" b="0"/>
             <wp:docPr id="47" name="Picture 47"/>
@@ -14482,7 +14485,7 @@
           <w:noProof/>
         </w:rPr>
         <w:drawing>
-          <wp:inline distT="0" distB="0" distL="0" distR="0" wp14:anchorId="0DD85E13" wp14:editId="409DC350">
+          <wp:inline distT="0" distB="0" distL="0" distR="0" wp14:anchorId="787DD8F4" wp14:editId="0EF8FCEF">
             <wp:extent cx="5760000" cy="728606"/>
             <wp:effectExtent l="0" t="0" r="0" b="0"/>
             <wp:docPr id="48" name="Picture 48"/>
@@ -14537,7 +14540,7 @@
           <w:noProof/>
         </w:rPr>
         <w:drawing>
-          <wp:inline distT="0" distB="0" distL="0" distR="0" wp14:anchorId="7F5AA7AE" wp14:editId="53DFB353">
+          <wp:inline distT="0" distB="0" distL="0" distR="0" wp14:anchorId="010C0CB5" wp14:editId="465031DA">
             <wp:extent cx="5760000" cy="728606"/>
             <wp:effectExtent l="0" t="0" r="0" b="0"/>
             <wp:docPr id="49" name="Picture 49"/>
@@ -14593,7 +14596,7 @@
         </w:rPr>
         <w:lastRenderedPageBreak/>
         <w:drawing>
-          <wp:inline distT="0" distB="0" distL="0" distR="0" wp14:anchorId="47EF4D65" wp14:editId="4278F827">
+          <wp:inline distT="0" distB="0" distL="0" distR="0" wp14:anchorId="0D955795" wp14:editId="354DB6D6">
             <wp:extent cx="5760000" cy="728606"/>
             <wp:effectExtent l="0" t="0" r="0" b="0"/>
             <wp:docPr id="50" name="Picture 50"/>
@@ -14648,7 +14651,7 @@
           <w:noProof/>
         </w:rPr>
         <w:drawing>
-          <wp:inline distT="0" distB="0" distL="0" distR="0" wp14:anchorId="35D4CF8D" wp14:editId="402B36D4">
+          <wp:inline distT="0" distB="0" distL="0" distR="0" wp14:anchorId="016C0311" wp14:editId="27BE560E">
             <wp:extent cx="5760000" cy="728606"/>
             <wp:effectExtent l="0" t="0" r="0" b="0"/>
             <wp:docPr id="51" name="Picture 51"/>
@@ -14703,7 +14706,7 @@
           <w:noProof/>
         </w:rPr>
         <w:drawing>
-          <wp:inline distT="0" distB="0" distL="0" distR="0" wp14:anchorId="54E33E5A" wp14:editId="2CDBECA5">
+          <wp:inline distT="0" distB="0" distL="0" distR="0" wp14:anchorId="4BF81760" wp14:editId="07A59D60">
             <wp:extent cx="5760000" cy="728606"/>
             <wp:effectExtent l="0" t="0" r="0" b="0"/>
             <wp:docPr id="52" name="Picture 52"/>
@@ -14758,7 +14761,7 @@
           <w:noProof/>
         </w:rPr>
         <w:drawing>
-          <wp:inline distT="0" distB="0" distL="0" distR="0" wp14:anchorId="0C1249A4" wp14:editId="349FC7EF">
+          <wp:inline distT="0" distB="0" distL="0" distR="0" wp14:anchorId="77931F6C" wp14:editId="6229713C">
             <wp:extent cx="5760000" cy="866295"/>
             <wp:effectExtent l="0" t="0" r="0" b="0"/>
             <wp:docPr id="53" name="Picture 53"/>
@@ -14813,7 +14816,7 @@
           <w:noProof/>
         </w:rPr>
         <w:drawing>
-          <wp:inline distT="0" distB="0" distL="0" distR="0" wp14:anchorId="70C5EDDE" wp14:editId="744359E0">
+          <wp:inline distT="0" distB="0" distL="0" distR="0" wp14:anchorId="6AEA0680" wp14:editId="2F08586F">
             <wp:extent cx="5760000" cy="866295"/>
             <wp:effectExtent l="0" t="0" r="0" b="0"/>
             <wp:docPr id="54" name="Picture 54"/>
@@ -14868,7 +14871,7 @@
           <w:noProof/>
         </w:rPr>
         <w:drawing>
-          <wp:inline distT="0" distB="0" distL="0" distR="0" wp14:anchorId="56DBECDF" wp14:editId="4E1B02A6">
+          <wp:inline distT="0" distB="0" distL="0" distR="0" wp14:anchorId="6E355E95" wp14:editId="107A662E">
             <wp:extent cx="5760000" cy="728606"/>
             <wp:effectExtent l="0" t="0" r="0" b="0"/>
             <wp:docPr id="55" name="Picture 55"/>
@@ -14923,7 +14926,7 @@
           <w:noProof/>
         </w:rPr>
         <w:drawing>
-          <wp:inline distT="0" distB="0" distL="0" distR="0" wp14:anchorId="7D4179C3" wp14:editId="53E9176A">
+          <wp:inline distT="0" distB="0" distL="0" distR="0" wp14:anchorId="42AEA37D" wp14:editId="40C2D5C4">
             <wp:extent cx="5760000" cy="728606"/>
             <wp:effectExtent l="0" t="0" r="0" b="0"/>
             <wp:docPr id="56" name="Picture 56"/>
@@ -14979,7 +14982,7 @@
         </w:rPr>
         <w:lastRenderedPageBreak/>
         <w:drawing>
-          <wp:inline distT="0" distB="0" distL="0" distR="0" wp14:anchorId="303414CD" wp14:editId="590EC766">
+          <wp:inline distT="0" distB="0" distL="0" distR="0" wp14:anchorId="0D8F9480" wp14:editId="5840B33D">
             <wp:extent cx="5760000" cy="728606"/>
             <wp:effectExtent l="0" t="0" r="0" b="0"/>
             <wp:docPr id="57" name="Picture 57"/>
@@ -15044,7 +15047,7 @@
       <w:pPr>
         <w:pStyle w:val="Heading1"/>
       </w:pPr>
-      <w:bookmarkStart w:id="40" w:name="_Toc241869388"/>
+      <w:bookmarkStart w:id="40" w:name="_Toc241877286"/>
       <w:r>
         <w:t>7. The form library</w:t>
       </w:r>
@@ -15054,7 +15057,7 @@
       <w:pPr>
         <w:pStyle w:val="Heading2"/>
       </w:pPr>
-      <w:bookmarkStart w:id="41" w:name="_Toc241869389"/>
+      <w:bookmarkStart w:id="41" w:name="_Toc241877287"/>
       <w:r>
         <w:t>7.1 Why it exists</w:t>
       </w:r>
@@ -15114,7 +15117,7 @@
       <w:pPr>
         <w:pStyle w:val="Heading2"/>
       </w:pPr>
-      <w:bookmarkStart w:id="42" w:name="_Toc241869390"/>
+      <w:bookmarkStart w:id="42" w:name="_Toc241877288"/>
       <w:r>
         <w:t>7.2 Running without the form library</w:t>
       </w:r>
@@ -15185,7 +15188,7 @@
       <w:pPr>
         <w:pStyle w:val="Heading2"/>
       </w:pPr>
-      <w:bookmarkStart w:id="43" w:name="_Toc241869391"/>
+      <w:bookmarkStart w:id="43" w:name="_Toc241877289"/>
       <w:r>
         <w:t>7.3 Adding the form library</w:t>
       </w:r>
@@ -15232,7 +15235,7 @@
         </w:rPr>
         <w:lastRenderedPageBreak/>
         <w:drawing>
-          <wp:inline distT="0" distB="0" distL="0" distR="0" wp14:anchorId="27048679" wp14:editId="73A79171">
+          <wp:inline distT="0" distB="0" distL="0" distR="0" wp14:anchorId="4529029A" wp14:editId="5155A6CF">
             <wp:extent cx="5760000" cy="3355644"/>
             <wp:effectExtent l="0" t="0" r="0" b="0"/>
             <wp:docPr id="58" name="Picture 58"/>
@@ -15328,7 +15331,7 @@
           <w:noProof/>
         </w:rPr>
         <w:drawing>
-          <wp:inline distT="0" distB="0" distL="0" distR="0" wp14:anchorId="7E8392CF" wp14:editId="18A40BA8">
+          <wp:inline distT="0" distB="0" distL="0" distR="0" wp14:anchorId="5DED3D5F" wp14:editId="71584E1C">
             <wp:extent cx="3655657" cy="3779999"/>
             <wp:effectExtent l="0" t="0" r="0" b="0"/>
             <wp:docPr id="59" name="Picture 59"/>
@@ -15396,7 +15399,7 @@
         </w:rPr>
         <w:lastRenderedPageBreak/>
         <w:drawing>
-          <wp:inline distT="0" distB="0" distL="0" distR="0" wp14:anchorId="685FFAA1" wp14:editId="451EE115">
+          <wp:inline distT="0" distB="0" distL="0" distR="0" wp14:anchorId="63B977E3" wp14:editId="5D393912">
             <wp:extent cx="5760000" cy="3355644"/>
             <wp:effectExtent l="0" t="0" r="0" b="0"/>
             <wp:docPr id="60" name="Picture 60"/>
@@ -15481,7 +15484,7 @@
           <w:noProof/>
         </w:rPr>
         <w:drawing>
-          <wp:inline distT="0" distB="0" distL="0" distR="0" wp14:anchorId="4CADC05D" wp14:editId="40B9928A">
+          <wp:inline distT="0" distB="0" distL="0" distR="0" wp14:anchorId="774F602C" wp14:editId="3B2962C2">
             <wp:extent cx="2331588" cy="3239999"/>
             <wp:effectExtent l="0" t="0" r="0" b="0"/>
             <wp:docPr id="61" name="Picture 61"/>
@@ -15663,7 +15666,7 @@
           <w:noProof/>
         </w:rPr>
         <w:drawing>
-          <wp:inline distT="0" distB="0" distL="0" distR="0" wp14:anchorId="2A37A169" wp14:editId="3337F47D">
+          <wp:inline distT="0" distB="0" distL="0" distR="0" wp14:anchorId="3DBE802C" wp14:editId="5047EDB4">
             <wp:extent cx="2239266" cy="4320000"/>
             <wp:effectExtent l="0" t="0" r="0" b="0"/>
             <wp:docPr id="62" name="Picture 62"/>
@@ -15731,7 +15734,7 @@
         </w:rPr>
         <w:lastRenderedPageBreak/>
         <w:drawing>
-          <wp:inline distT="0" distB="0" distL="0" distR="0" wp14:anchorId="04AB33DC" wp14:editId="36F1273C">
+          <wp:inline distT="0" distB="0" distL="0" distR="0" wp14:anchorId="7276E46F" wp14:editId="5626728E">
             <wp:extent cx="2331588" cy="3239999"/>
             <wp:effectExtent l="0" t="0" r="0" b="0"/>
             <wp:docPr id="63" name="Picture 63"/>
@@ -15842,7 +15845,7 @@
       <w:pPr>
         <w:pStyle w:val="Heading2"/>
       </w:pPr>
-      <w:bookmarkStart w:id="44" w:name="_Toc241869392"/>
+      <w:bookmarkStart w:id="44" w:name="_Toc241877290"/>
       <w:r>
         <w:t>7.4 Removing the form library</w:t>
       </w:r>
@@ -15937,7 +15940,7 @@
       <w:pPr>
         <w:pStyle w:val="Heading1"/>
       </w:pPr>
-      <w:bookmarkStart w:id="45" w:name="_Toc241869393"/>
+      <w:bookmarkStart w:id="45" w:name="_Toc241877291"/>
       <w:r>
         <w:t>8. Security and permissions</w:t>
       </w:r>
@@ -16204,7 +16207,7 @@
       <w:pPr>
         <w:pStyle w:val="Heading1"/>
       </w:pPr>
-      <w:bookmarkStart w:id="46" w:name="_Toc241869394"/>
+      <w:bookmarkStart w:id="46" w:name="_Toc241877292"/>
       <w:r>
         <w:t>9. Upgrading</w:t>
       </w:r>
@@ -16310,7 +16313,7 @@
       <w:pPr>
         <w:pStyle w:val="Heading1"/>
       </w:pPr>
-      <w:bookmarkStart w:id="47" w:name="_Toc241869395"/>
+      <w:bookmarkStart w:id="47" w:name="_Toc241877293"/>
       <w:r>
         <w:t>10. Uninstalling</w:t>
       </w:r>
@@ -16325,7 +16328,7 @@
       <w:pPr>
         <w:pStyle w:val="Heading2"/>
       </w:pPr>
-      <w:bookmarkStart w:id="48" w:name="_Toc241869396"/>
+      <w:bookmarkStart w:id="48" w:name="_Toc241877294"/>
       <w:r>
         <w:t>10.1 Remove the control from the forms</w:t>
       </w:r>
@@ -16381,7 +16384,7 @@
         </w:rPr>
         <w:lastRenderedPageBreak/>
         <w:drawing>
-          <wp:inline distT="0" distB="0" distL="0" distR="0" wp14:anchorId="5C7AF7FF" wp14:editId="7488CB40">
+          <wp:inline distT="0" distB="0" distL="0" distR="0" wp14:anchorId="1C0591B9" wp14:editId="1CB41B69">
             <wp:extent cx="2295828" cy="3240000"/>
             <wp:effectExtent l="0" t="0" r="0" b="0"/>
             <wp:docPr id="64" name="Picture 64"/>
@@ -16448,7 +16451,7 @@
           <w:noProof/>
         </w:rPr>
         <w:drawing>
-          <wp:inline distT="0" distB="0" distL="0" distR="0" wp14:anchorId="3EEA3961" wp14:editId="3AA82411">
+          <wp:inline distT="0" distB="0" distL="0" distR="0" wp14:anchorId="448C3D46" wp14:editId="53176DC3">
             <wp:extent cx="2295828" cy="3240000"/>
             <wp:effectExtent l="0" t="0" r="0" b="0"/>
             <wp:docPr id="65" name="Picture 65"/>
@@ -16539,7 +16542,7 @@
       <w:pPr>
         <w:pStyle w:val="Heading2"/>
       </w:pPr>
-      <w:bookmarkStart w:id="49" w:name="_Toc241869397"/>
+      <w:bookmarkStart w:id="49" w:name="_Toc241877295"/>
       <w:r>
         <w:t>10.2 Uninstall the managed solution</w:t>
       </w:r>
@@ -16595,7 +16598,7 @@
         </w:rPr>
         <w:lastRenderedPageBreak/>
         <w:drawing>
-          <wp:inline distT="0" distB="0" distL="0" distR="0" wp14:anchorId="5F7C743E" wp14:editId="44846715">
+          <wp:inline distT="0" distB="0" distL="0" distR="0" wp14:anchorId="44DAA8AF" wp14:editId="1386090F">
             <wp:extent cx="5760000" cy="3011054"/>
             <wp:effectExtent l="0" t="0" r="0" b="0"/>
             <wp:docPr id="66" name="Picture 66"/>
@@ -16671,7 +16674,7 @@
           <w:noProof/>
         </w:rPr>
         <w:drawing>
-          <wp:inline distT="0" distB="0" distL="0" distR="0" wp14:anchorId="2673746F" wp14:editId="36469E11">
+          <wp:inline distT="0" distB="0" distL="0" distR="0" wp14:anchorId="181642DE" wp14:editId="290FFDE4">
             <wp:extent cx="5760000" cy="3011054"/>
             <wp:effectExtent l="0" t="0" r="0" b="0"/>
             <wp:docPr id="67" name="Picture 67"/>
@@ -16748,7 +16751,7 @@
         </w:rPr>
         <w:lastRenderedPageBreak/>
         <w:drawing>
-          <wp:inline distT="0" distB="0" distL="0" distR="0" wp14:anchorId="4E2AC08D" wp14:editId="5929BAE9">
+          <wp:inline distT="0" distB="0" distL="0" distR="0" wp14:anchorId="658BD2FE" wp14:editId="402A38D5">
             <wp:extent cx="3960000" cy="1718491"/>
             <wp:effectExtent l="0" t="0" r="0" b="0"/>
             <wp:docPr id="68" name="Picture 68"/>
@@ -16815,7 +16818,7 @@
           <w:noProof/>
         </w:rPr>
         <w:drawing>
-          <wp:inline distT="0" distB="0" distL="0" distR="0" wp14:anchorId="30F466BF" wp14:editId="2B1668A8">
+          <wp:inline distT="0" distB="0" distL="0" distR="0" wp14:anchorId="2ED32610" wp14:editId="7567EFC1">
             <wp:extent cx="5760000" cy="3011054"/>
             <wp:effectExtent l="0" t="0" r="0" b="0"/>
             <wp:docPr id="69" name="Picture 69"/>
@@ -16864,7 +16867,7 @@
       <w:pPr>
         <w:pStyle w:val="Heading2"/>
       </w:pPr>
-      <w:bookmarkStart w:id="50" w:name="_Toc241869398"/>
+      <w:bookmarkStart w:id="50" w:name="_Toc241877296"/>
       <w:r>
         <w:t>10.3 Uninstall the unmanaged solution</w:t>
       </w:r>
@@ -16945,7 +16948,7 @@
         </w:rPr>
         <w:lastRenderedPageBreak/>
         <w:drawing>
-          <wp:inline distT="0" distB="0" distL="0" distR="0" wp14:anchorId="15B9C283" wp14:editId="1267C807">
+          <wp:inline distT="0" distB="0" distL="0" distR="0" wp14:anchorId="2F65A4F1" wp14:editId="697585B1">
             <wp:extent cx="5760000" cy="2062425"/>
             <wp:effectExtent l="0" t="0" r="0" b="0"/>
             <wp:docPr id="70" name="Picture 70"/>
@@ -17024,7 +17027,7 @@
           <w:noProof/>
         </w:rPr>
         <w:drawing>
-          <wp:inline distT="0" distB="0" distL="0" distR="0" wp14:anchorId="32715D01" wp14:editId="4209CC80">
+          <wp:inline distT="0" distB="0" distL="0" distR="0" wp14:anchorId="5C96D6D4" wp14:editId="21BC62B4">
             <wp:extent cx="3960000" cy="1718491"/>
             <wp:effectExtent l="0" t="0" r="0" b="0"/>
             <wp:docPr id="71" name="Picture 71"/>
@@ -17153,7 +17156,7 @@
           <w:noProof/>
         </w:rPr>
         <w:drawing>
-          <wp:inline distT="0" distB="0" distL="0" distR="0" wp14:anchorId="0CF71BE0" wp14:editId="7EF51DE3">
+          <wp:inline distT="0" distB="0" distL="0" distR="0" wp14:anchorId="53234524" wp14:editId="0B20674C">
             <wp:extent cx="3960000" cy="1878598"/>
             <wp:effectExtent l="0" t="0" r="0" b="0"/>
             <wp:docPr id="72" name="Picture 72"/>
@@ -17228,7 +17231,7 @@
       <w:pPr>
         <w:pStyle w:val="Heading1"/>
       </w:pPr>
-      <w:bookmarkStart w:id="51" w:name="_Toc241869399"/>
+      <w:bookmarkStart w:id="51" w:name="_Toc241877297"/>
       <w:r>
         <w:lastRenderedPageBreak/>
         <w:t>11. Troubleshooting</w:t>
@@ -17799,7 +17802,7 @@
       <w:pPr>
         <w:pStyle w:val="Heading1"/>
       </w:pPr>
-      <w:bookmarkStart w:id="52" w:name="_Toc241869400"/>
+      <w:bookmarkStart w:id="52" w:name="_Toc241877298"/>
       <w:r>
         <w:t>12. Limitations</w:t>
       </w:r>
@@ -18383,7 +18386,7 @@
       <w:pPr>
         <w:pStyle w:val="Heading1"/>
       </w:pPr>
-      <w:bookmarkStart w:id="53" w:name="_Toc241869401"/>
+      <w:bookmarkStart w:id="53" w:name="_Toc241877299"/>
       <w:r>
         <w:t xml:space="preserve">13. Improving the control with a </w:t>
       </w:r>
@@ -18424,7 +18427,7 @@
       <w:pPr>
         <w:pStyle w:val="Heading2"/>
       </w:pPr>
-      <w:bookmarkStart w:id="54" w:name="_Toc241869402"/>
+      <w:bookmarkStart w:id="54" w:name="_Toc241877300"/>
       <w:r>
         <w:t>13.1 Keeping the names column exact</w:t>
       </w:r>
@@ -19252,7 +19255,7 @@
       <w:pPr>
         <w:pStyle w:val="Heading2"/>
       </w:pPr>
-      <w:bookmarkStart w:id="55" w:name="_Toc241869403"/>
+      <w:bookmarkStart w:id="55" w:name="_Toc241877301"/>
       <w:r>
         <w:t>13.2 Enforcing the rules on the server</w:t>
       </w:r>
@@ -19842,7 +19845,7 @@
       <w:pPr>
         <w:pStyle w:val="Heading1"/>
       </w:pPr>
-      <w:bookmarkStart w:id="56" w:name="_Toc241869404"/>
+      <w:bookmarkStart w:id="56" w:name="_Toc241877302"/>
       <w:r>
         <w:t>Appendix A. All texts in English and French</w:t>
       </w:r>
@@ -19860,7 +19863,7 @@
       <w:pPr>
         <w:pStyle w:val="Heading2"/>
       </w:pPr>
-      <w:bookmarkStart w:id="57" w:name="_Toc241869405"/>
+      <w:bookmarkStart w:id="57" w:name="_Toc241877303"/>
       <w:r>
         <w:t>A.1 Field and list</w:t>
       </w:r>
@@ -20493,7 +20496,7 @@
       <w:pPr>
         <w:pStyle w:val="Heading2"/>
       </w:pPr>
-      <w:bookmarkStart w:id="58" w:name="_Toc241869406"/>
+      <w:bookmarkStart w:id="58" w:name="_Toc241877304"/>
       <w:r>
         <w:t xml:space="preserve">A.2 </w:t>
       </w:r>
@@ -21040,7 +21043,7 @@
       <w:pPr>
         <w:pStyle w:val="Heading2"/>
       </w:pPr>
-      <w:bookmarkStart w:id="59" w:name="_Toc241869407"/>
+      <w:bookmarkStart w:id="59" w:name="_Toc241877305"/>
       <w:r>
         <w:t>A.3 Problems while loading or saving</w:t>
       </w:r>
@@ -21915,7 +21918,7 @@
       <w:pPr>
         <w:pStyle w:val="Heading2"/>
       </w:pPr>
-      <w:bookmarkStart w:id="60" w:name="_Toc241869408"/>
+      <w:bookmarkStart w:id="60" w:name="_Toc241877306"/>
       <w:r>
         <w:lastRenderedPageBreak/>
         <w:t>A.4 Settings that cannot work</w:t>
@@ -22779,7 +22782,7 @@
       <w:pPr>
         <w:pStyle w:val="Heading2"/>
       </w:pPr>
-      <w:bookmarkStart w:id="61" w:name="_Toc241869409"/>
+      <w:bookmarkStart w:id="61" w:name="_Toc241877307"/>
       <w:r>
         <w:lastRenderedPageBreak/>
         <w:t>A.5 Reasons added to a problem</w:t>
@@ -23316,7 +23319,7 @@
       <w:pPr>
         <w:pStyle w:val="Heading2"/>
       </w:pPr>
-      <w:bookmarkStart w:id="62" w:name="_Toc241869410"/>
+      <w:bookmarkStart w:id="62" w:name="_Toc241877308"/>
       <w:r>
         <w:t>A.6 Screen reader texts and tooltips</w:t>
       </w:r>
@@ -24687,94 +24690,94 @@
       </w:rPr>
     </w:lvl>
   </w:abstractNum>
-  <w:num w:numId="1" w16cid:durableId="417137606">
+  <w:num w:numId="1" w16cid:durableId="1746762811">
     <w:abstractNumId w:val="8"/>
   </w:num>
-  <w:num w:numId="2" w16cid:durableId="897592847">
+  <w:num w:numId="2" w16cid:durableId="966470492">
     <w:abstractNumId w:val="6"/>
   </w:num>
-  <w:num w:numId="3" w16cid:durableId="2022510419">
+  <w:num w:numId="3" w16cid:durableId="1029143499">
     <w:abstractNumId w:val="5"/>
   </w:num>
-  <w:num w:numId="4" w16cid:durableId="1082990990">
+  <w:num w:numId="4" w16cid:durableId="1453786575">
     <w:abstractNumId w:val="4"/>
   </w:num>
-  <w:num w:numId="5" w16cid:durableId="1713773235">
+  <w:num w:numId="5" w16cid:durableId="1427842732">
     <w:abstractNumId w:val="7"/>
   </w:num>
-  <w:num w:numId="6" w16cid:durableId="1790932218">
+  <w:num w:numId="6" w16cid:durableId="434981165">
     <w:abstractNumId w:val="3"/>
   </w:num>
-  <w:num w:numId="7" w16cid:durableId="580061886">
+  <w:num w:numId="7" w16cid:durableId="1473789182">
     <w:abstractNumId w:val="2"/>
   </w:num>
-  <w:num w:numId="8" w16cid:durableId="2143500861">
+  <w:num w:numId="8" w16cid:durableId="363403615">
     <w:abstractNumId w:val="1"/>
   </w:num>
-  <w:num w:numId="9" w16cid:durableId="729352945">
+  <w:num w:numId="9" w16cid:durableId="1496536026">
     <w:abstractNumId w:val="0"/>
   </w:num>
-  <w:num w:numId="10" w16cid:durableId="1470592589">
+  <w:num w:numId="10" w16cid:durableId="998074707">
     <w:abstractNumId w:val="7"/>
     <w:lvlOverride w:ilvl="0">
       <w:startOverride w:val="1"/>
     </w:lvlOverride>
   </w:num>
-  <w:num w:numId="11" w16cid:durableId="787427">
+  <w:num w:numId="11" w16cid:durableId="331300485">
     <w:abstractNumId w:val="7"/>
     <w:lvlOverride w:ilvl="0">
       <w:startOverride w:val="1"/>
     </w:lvlOverride>
   </w:num>
-  <w:num w:numId="12" w16cid:durableId="11690712">
+  <w:num w:numId="12" w16cid:durableId="1011880658">
     <w:abstractNumId w:val="7"/>
     <w:lvlOverride w:ilvl="0">
       <w:startOverride w:val="1"/>
     </w:lvlOverride>
   </w:num>
-  <w:num w:numId="13" w16cid:durableId="403335948">
+  <w:num w:numId="13" w16cid:durableId="1890603352">
     <w:abstractNumId w:val="7"/>
     <w:lvlOverride w:ilvl="0">
       <w:startOverride w:val="1"/>
     </w:lvlOverride>
   </w:num>
-  <w:num w:numId="14" w16cid:durableId="931815069">
+  <w:num w:numId="14" w16cid:durableId="1032875405">
     <w:abstractNumId w:val="7"/>
     <w:lvlOverride w:ilvl="0">
       <w:startOverride w:val="1"/>
     </w:lvlOverride>
   </w:num>
-  <w:num w:numId="15" w16cid:durableId="1045570106">
+  <w:num w:numId="15" w16cid:durableId="1087115085">
     <w:abstractNumId w:val="7"/>
     <w:lvlOverride w:ilvl="0">
       <w:startOverride w:val="1"/>
     </w:lvlOverride>
   </w:num>
-  <w:num w:numId="16" w16cid:durableId="424232695">
+  <w:num w:numId="16" w16cid:durableId="68891189">
     <w:abstractNumId w:val="7"/>
     <w:lvlOverride w:ilvl="0">
       <w:startOverride w:val="1"/>
     </w:lvlOverride>
   </w:num>
-  <w:num w:numId="17" w16cid:durableId="2114550668">
+  <w:num w:numId="17" w16cid:durableId="1414083086">
     <w:abstractNumId w:val="7"/>
     <w:lvlOverride w:ilvl="0">
       <w:startOverride w:val="1"/>
     </w:lvlOverride>
   </w:num>
-  <w:num w:numId="18" w16cid:durableId="566846329">
+  <w:num w:numId="18" w16cid:durableId="951666599">
     <w:abstractNumId w:val="7"/>
     <w:lvlOverride w:ilvl="0">
       <w:startOverride w:val="1"/>
     </w:lvlOverride>
   </w:num>
-  <w:num w:numId="19" w16cid:durableId="399787734">
+  <w:num w:numId="19" w16cid:durableId="1990554900">
     <w:abstractNumId w:val="7"/>
     <w:lvlOverride w:ilvl="0">
       <w:startOverride w:val="1"/>
     </w:lvlOverride>
   </w:num>
-  <w:num w:numId="20" w16cid:durableId="2140950897">
+  <w:num w:numId="20" w16cid:durableId="2091535102">
     <w:abstractNumId w:val="7"/>
     <w:lvlOverride w:ilvl="0">
       <w:startOverride w:val="1"/>
@@ -36170,7 +36173,7 @@
     <w:autoRedefine/>
     <w:uiPriority w:val="39"/>
     <w:unhideWhenUsed/>
-    <w:rsid w:val="00D02F74"/>
+    <w:rsid w:val="00A1027B"/>
     <w:pPr>
       <w:spacing w:after="100"/>
     </w:pPr>
@@ -36182,7 +36185,7 @@
     <w:autoRedefine/>
     <w:uiPriority w:val="39"/>
     <w:unhideWhenUsed/>
-    <w:rsid w:val="00D02F74"/>
+    <w:rsid w:val="00A1027B"/>
     <w:pPr>
       <w:spacing w:after="100"/>
       <w:ind w:left="210"/>
@@ -36193,7 +36196,7 @@
     <w:basedOn w:val="DefaultParagraphFont"/>
     <w:uiPriority w:val="99"/>
     <w:unhideWhenUsed/>
-    <w:rsid w:val="00D02F74"/>
+    <w:rsid w:val="00A1027B"/>
     <w:rPr>
       <w:color w:val="0000FF" w:themeColor="hyperlink"/>
       <w:u w:val="single"/>

</xml_diff>